<commit_message>
docs: fill MTU & notify-vs-indicate notes in 26-Jun note; guard generator
Sisipkan paragraf nuansa negosiasi MTU (fallback 23, chunk MTU-4) dan alasan memilih notify+ACK vs indicate ke docx secara in-place (menjaga penjelasan gambar tulisan tangan). Rapikan tanda baca. Generator kini menolak menimpa docx yang sudah ada kecuali --force, agar suntingan manual tidak hilang.
</commit_message>
<xml_diff>
--- a/docs/26-06-26-Catatan-Faik-BLE-SmartWatch.docx
+++ b/docs/26-06-26-Catatan-Faik-BLE-SmartWatch.docx
@@ -46,93 +46,47 @@
         <w:jc w:val="both"/>
       </w:pPr>
       <w:r>
-        <w:t xml:space="preserve">Smartwatch menyediakan satu layanan kustom (UUID 0000a100) yang memuat dua karakteristik. Karakteristik pertama (0000a101) bertipe notify dan </w:t>
-      </w:r>
-      <w:proofErr w:type="spellStart"/>
-      <w:r>
-        <w:t>dilengkapi</w:t>
-      </w:r>
-      <w:proofErr w:type="spellEnd"/>
-      <w:r>
-        <w:t xml:space="preserve"> </w:t>
-      </w:r>
-      <w:proofErr w:type="spellStart"/>
-      <w:r>
-        <w:t>deskriptor</w:t>
-      </w:r>
-      <w:proofErr w:type="spellEnd"/>
-      <w:r>
-        <w:t xml:space="preserve"> CCCD</w:t>
-      </w:r>
-      <w:r>
-        <w:t xml:space="preserve"> </w:t>
-      </w:r>
-      <w:r>
-        <w:t>(</w:t>
-      </w:r>
-      <w:r>
-        <w:t>Client Characteristic Configuration Descriptor</w:t>
-      </w:r>
-      <w:r>
-        <w:t>)</w:t>
-      </w:r>
-      <w:r>
-        <w:t xml:space="preserve"> (0x2902) lewat karakteristik inilah paket data detak jantung dikirim ke smartphone. </w:t>
-      </w:r>
-      <w:proofErr w:type="spellStart"/>
-      <w:r>
-        <w:t>Karakteristik</w:t>
-      </w:r>
-      <w:proofErr w:type="spellEnd"/>
-      <w:r>
-        <w:t xml:space="preserve"> </w:t>
-      </w:r>
-      <w:proofErr w:type="spellStart"/>
-      <w:r>
-        <w:t>kedua</w:t>
-      </w:r>
-      <w:proofErr w:type="spellEnd"/>
-      <w:r>
-        <w:t xml:space="preserve"> (0000a102) </w:t>
-      </w:r>
-      <w:proofErr w:type="spellStart"/>
-      <w:r>
-        <w:t>bertipe</w:t>
-      </w:r>
-      <w:proofErr w:type="spellEnd"/>
-      <w:r>
-        <w:t xml:space="preserve"> write</w:t>
-      </w:r>
-      <w:r>
-        <w:t xml:space="preserve"> </w:t>
-      </w:r>
-      <w:r>
-        <w:t xml:space="preserve">dan </w:t>
-      </w:r>
-      <w:proofErr w:type="spellStart"/>
-      <w:r>
-        <w:t>dipakai</w:t>
-      </w:r>
-      <w:proofErr w:type="spellEnd"/>
-      <w:r>
-        <w:t xml:space="preserve"> smartphone </w:t>
-      </w:r>
-      <w:proofErr w:type="spellStart"/>
-      <w:r>
-        <w:t>untuk</w:t>
-      </w:r>
-      <w:proofErr w:type="spellEnd"/>
-      <w:r>
-        <w:t xml:space="preserve"> </w:t>
-      </w:r>
-      <w:proofErr w:type="spellStart"/>
-      <w:r>
-        <w:t>menuliskan</w:t>
-      </w:r>
-      <w:proofErr w:type="spellEnd"/>
-      <w:r>
-        <w:t xml:space="preserve"> konfirmasi penerimaan (acknowledgement, ACK) atas data yang diterima. Ketiga UUID merupakan UUID 128-bit yang dibangun dari alias 16-bit A100/A101/A102 pada base UUID Bluetooth.</w:t>
-      </w:r>
+        <w:t>Smartwatch menyediakan satu layanan kustom (UUID 0000a100) yang memuat dua karakteristik. Karakteristik pertama (0000a101) bertipe notify dan dilengkapi deskriptor CCCD (Client Characteristic Configuration Descriptor) (0x2902); lewat karakteristik inilah paket data detak jantung dikirim ke smartphone. Karakteristik kedua (0000a102) bertipe write dan dipakai smartphone untuk menuliskan konfirmasi penerimaan (acknowledgement, ACK) atas data yang diterima. Ketiga UUID merupakan UUID 128-bit yang dibangun dari alias 16-bit A100/A101/A102 pada base UUID Bluetooth.</w:t>
+      </w:r>
+      <w:proofErr w:type="spellStart"/>
+      <w:r/>
+      <w:proofErr w:type="spellEnd"/>
+      <w:r/>
+      <w:proofErr w:type="spellStart"/>
+      <w:r/>
+      <w:proofErr w:type="spellEnd"/>
+      <w:r/>
+      <w:r/>
+      <w:r/>
+      <w:r/>
+      <w:r/>
+      <w:r/>
+      <w:proofErr w:type="spellStart"/>
+      <w:r/>
+      <w:proofErr w:type="spellEnd"/>
+      <w:r/>
+      <w:proofErr w:type="spellStart"/>
+      <w:r/>
+      <w:proofErr w:type="spellEnd"/>
+      <w:r/>
+      <w:proofErr w:type="spellStart"/>
+      <w:r/>
+      <w:proofErr w:type="spellEnd"/>
+      <w:r/>
+      <w:r/>
+      <w:r/>
+      <w:proofErr w:type="spellStart"/>
+      <w:r/>
+      <w:proofErr w:type="spellEnd"/>
+      <w:r/>
+      <w:proofErr w:type="spellStart"/>
+      <w:r/>
+      <w:proofErr w:type="spellEnd"/>
+      <w:r/>
+      <w:proofErr w:type="spellStart"/>
+      <w:r/>
+      <w:proofErr w:type="spellEnd"/>
+      <w:r/>
     </w:p>
     <w:p>
       <w:r>
@@ -151,6 +105,17 @@
       </w:r>
     </w:p>
     <w:p>
+      <w:pPr>
+        <w:jc w:val="both"/>
+      </w:pPr>
+      <w:r>
+        <w:rPr>
+          <w:b w:val="0"/>
+        </w:rPr>
+        <w:t>Perlu dicatat bahwa 512 byte hanyalah nilai yang diminta; MTU final ditentukan melalui negosiasi dan sama dengan kemampuan terkecil di antara kedua perangkat, sehingga bisa lebih kecil dari 512. Sebagian perangkat bahkan menolak permintaan ini dan tetap memakai MTU default (23 byte). Sistem menangani kedua kemungkinan tersebut: ukuran potongan (chunk) tiap frame dihitung menyesuaikan MTU yang disepakati, yaitu maksimum MTU-4 byte. Bila MTU besar, jumlah frame sedikit dan transfer lebih cepat; bila MTU kecil, jumlah frame lebih banyak dan transfer lebih lambat, tetapi data tetap utuh dan tidak ada yang hilang. Dengan kata lain, MTU memengaruhi kecepatan/efisiensi pengiriman, bukan kebenaran datanya.</w:t>
+      </w:r>
+    </w:p>
+    <w:p>
       <w:r>
         <w:rPr>
           <w:b/>
@@ -183,6 +148,17 @@
       </w:r>
     </w:p>
     <w:p>
+      <w:pPr>
+        <w:jc w:val="both"/>
+      </w:pPr>
+      <w:r>
+        <w:rPr>
+          <w:b w:val="0"/>
+        </w:rPr>
+        <w:t>Notifikasi BLE bersifat fire-and-forget: pada lapisan ATT tidak ada konfirmasi penerimaan, sehingga smartwatch tidak otomatis tahu apakah paket benar-benar sampai. BLE menyediakan mekanisme alternatif bernama indication yang berkonfirmasi, tetapi konfirmasinya terjadi per pesan sehingga lebih lambat. Sistem ini sengaja memilih notify (cepat) lalu menambahkan konfirmasi sendiri di lapisan aplikasi (ACK) sekali per paket - lebih efisien daripada indication yang berkonfirmasi tiap frame. Mekanisme konfirmasi ini dijelaskan pada bagian berikut.</w:t>
+      </w:r>
+    </w:p>
+    <w:p>
       <w:r>
         <w:rPr>
           <w:b/>
@@ -195,68 +171,37 @@
         <w:jc w:val="both"/>
       </w:pPr>
       <w:r>
-        <w:t xml:space="preserve">Setelah seluruh paket tersimpan di smartphone, smartphone menuliskan jumlah record yang berhasil disimpan ke karakteristik ACK (0000a102). Smartwatch baru menandai data </w:t>
-      </w:r>
-      <w:r>
-        <w:lastRenderedPageBreak/>
-        <w:t xml:space="preserve">tersebut sebagai sudah terkirim (synced = 1) setelah menerima ACK ini. Bila ACK tidak diterima dalam tenggang waktu (30 detik) misalnya aplikasi penerima berhenti atau koneksi terputus - data tetap berstatus belum terkirim dan akan dikirim ulang pada giliran berikutnya. Mekanisme ini menutup celah data </w:t>
-      </w:r>
-      <w:proofErr w:type="spellStart"/>
-      <w:r>
-        <w:t>dianggap</w:t>
-      </w:r>
-      <w:proofErr w:type="spellEnd"/>
-      <w:r>
-        <w:t xml:space="preserve"> </w:t>
-      </w:r>
-      <w:proofErr w:type="spellStart"/>
-      <w:r>
-        <w:t>terkirim</w:t>
-      </w:r>
-      <w:proofErr w:type="spellEnd"/>
-      <w:r>
-        <w:t xml:space="preserve"> </w:t>
-      </w:r>
-      <w:proofErr w:type="spellStart"/>
-      <w:r>
-        <w:t>padahal</w:t>
-      </w:r>
-      <w:proofErr w:type="spellEnd"/>
-      <w:r>
-        <w:t xml:space="preserve"> </w:t>
-      </w:r>
-      <w:proofErr w:type="spellStart"/>
-      <w:r>
-        <w:t>penerima</w:t>
-      </w:r>
-      <w:proofErr w:type="spellEnd"/>
-      <w:r>
-        <w:t xml:space="preserve"> </w:t>
-      </w:r>
-      <w:proofErr w:type="spellStart"/>
-      <w:r>
-        <w:t>tidak</w:t>
-      </w:r>
-      <w:proofErr w:type="spellEnd"/>
-      <w:r>
-        <w:t xml:space="preserve"> </w:t>
-      </w:r>
-      <w:proofErr w:type="spellStart"/>
-      <w:r>
-        <w:t>benar-benar</w:t>
-      </w:r>
-      <w:proofErr w:type="spellEnd"/>
-      <w:r>
-        <w:t xml:space="preserve"> </w:t>
-      </w:r>
-      <w:proofErr w:type="spellStart"/>
-      <w:r>
-        <w:t>menerimanya</w:t>
-      </w:r>
-      <w:proofErr w:type="spellEnd"/>
-      <w:r>
-        <w:t>.</w:t>
-      </w:r>
+        <w:t>Setelah seluruh paket tersimpan di smartphone, smartphone menuliskan jumlah record yang berhasil disimpan ke karakteristik ACK (0000a102). Smartwatch baru menandai data tersebut sebagai sudah terkirim (synced = 1) setelah menerima ACK ini. Bila ACK tidak diterima dalam tenggang waktu (30 detik) - misalnya aplikasi penerima berhenti atau koneksi terputus - data tetap berstatus belum terkirim dan akan dikirim ulang pada giliran berikutnya. Mekanisme ini menutup celah "data dianggap terkirim padahal penerima tidak benar-benar menerimanya".</w:t>
+      </w:r>
+      <w:r/>
+      <w:proofErr w:type="spellStart"/>
+      <w:r/>
+      <w:proofErr w:type="spellEnd"/>
+      <w:r/>
+      <w:proofErr w:type="spellStart"/>
+      <w:r/>
+      <w:proofErr w:type="spellEnd"/>
+      <w:r/>
+      <w:proofErr w:type="spellStart"/>
+      <w:r/>
+      <w:proofErr w:type="spellEnd"/>
+      <w:r/>
+      <w:proofErr w:type="spellStart"/>
+      <w:r/>
+      <w:proofErr w:type="spellEnd"/>
+      <w:r/>
+      <w:proofErr w:type="spellStart"/>
+      <w:r/>
+      <w:proofErr w:type="spellEnd"/>
+      <w:r/>
+      <w:proofErr w:type="spellStart"/>
+      <w:r/>
+      <w:proofErr w:type="spellEnd"/>
+      <w:r/>
+      <w:proofErr w:type="spellStart"/>
+      <w:r/>
+      <w:proofErr w:type="spellEnd"/>
+      <w:r/>
     </w:p>
     <w:p>
       <w:r>

</xml_diff>

<commit_message>
docs: add MTU diagram (Gambar 1) and clarify negotiation accept/reject
Sisipkan diagram negosiasi MTU di bagian MTU (Gambar 1), perjelas mekanisme terima/tolak di Paragraf A, tambah acuan ke Gambar 1, dan geser penomoran gambar lain (GATT->2, framing->3).
</commit_message>
<xml_diff>
--- a/docs/26-06-26-Catatan-Faik-BLE-SmartWatch.docx
+++ b/docs/26-06-26-Catatan-Faik-BLE-SmartWatch.docx
@@ -12,33 +12,11 @@
       </w:r>
     </w:p>
     <w:p>
-      <w:proofErr w:type="spellStart"/>
       <w:r>
         <w:rPr>
           <w:b/>
         </w:rPr>
-        <w:t>Struktur</w:t>
-      </w:r>
-      <w:proofErr w:type="spellEnd"/>
-      <w:r>
-        <w:rPr>
-          <w:b/>
-        </w:rPr>
-        <w:t xml:space="preserve"> </w:t>
-      </w:r>
-      <w:proofErr w:type="spellStart"/>
-      <w:r>
-        <w:rPr>
-          <w:b/>
-        </w:rPr>
-        <w:t>Layanan</w:t>
-      </w:r>
-      <w:proofErr w:type="spellEnd"/>
-      <w:r>
-        <w:rPr>
-          <w:b/>
-        </w:rPr>
-        <w:t xml:space="preserve"> GATT</w:t>
+        <w:t>Struktur Layanan GATT</w:t>
       </w:r>
     </w:p>
     <w:p>
@@ -70,25 +48,24 @@
         <w:jc w:val="both"/>
       </w:pPr>
       <w:r>
-        <w:t>Angka 512 byte hanyalah nilai yang diminta ponsel. MTU yang sebenarnya dipakai ditentukan lewat negosiasi. Nilainya mengikuti kemampuan terkecil dari kedua perangkat, jadi bisa lebih kecil dari 512. Jika permintaan ditolak, MTU tetap memakai nilai default 23 byte.</w:t>
+        <w:t>Angka 512 byte merupakan nilai yang diminta ponsel. Ponsel mengusulkan 512, lalu watch membalas dengan nilai MTU yang sanggup ia dukung. Nilai yang dipakai adalah yang terkecil di antara keduanya, jadi bisa lebih kecil dari 512. Negosiasi ini ditangani oleh sistem Bluetooth, bukan oleh kode aplikasi. Kadang negosiasi gagal, misalnya karena perangkat tidak mendukung MTU besar. Bila gagal, MTU tetap memakai nilai default 23 byte.</w:t>
       </w:r>
+      <w:r/>
+      <w:r/>
     </w:p>
     <w:p>
       <w:pPr>
         <w:jc w:val="both"/>
       </w:pPr>
       <w:r>
-        <w:rPr>
-          <w:b w:val="0"/>
-        </w:rPr>
         <w:t>Besar potongan data (chunk) pada tiap frame mengikuti MTU, yaitu MTU dikurangi 4 byte. Karena itu, MTU hanya menentukan banyaknya potongan, bukan kelengkapan data. Setiap batch selalu diawali satu frame START dan ditutup satu frame END. Yang berubah hanya jumlah frame DATA di antara keduanya. Bila MTU besar, potongannya besar, sehingga frame DATA sedikit dan transfer cepat. Bila MTU kecil, potongannya kecil, sehingga frame DATA banyak dan transfer lambat. Tabel berikut membandingkan satu batch (sekitar 228 record, ~10.717 byte) pada dua nilai MTU:</w:t>
       </w:r>
     </w:p>
     <w:tbl>
       <w:tblPr>
         <w:tblStyle w:val="TableGrid"/>
-        <w:tblW w:type="auto" w:w="0"/>
-        <w:tblLook w:firstColumn="1" w:firstRow="1" w:lastColumn="0" w:lastRow="0" w:noHBand="0" w:noVBand="1" w:val="04A0"/>
+        <w:tblW w:w="0" w:type="auto"/>
+        <w:tblLook w:val="04A0" w:firstRow="1" w:lastRow="0" w:firstColumn="1" w:lastColumn="0" w:noHBand="0" w:noVBand="1"/>
       </w:tblPr>
       <w:tblGrid>
         <w:gridCol w:w="2160"/>
@@ -99,7 +76,7 @@
       <w:tr>
         <w:tc>
           <w:tcPr>
-            <w:tcW w:type="dxa" w:w="2160"/>
+            <w:tcW w:w="2160" w:type="dxa"/>
           </w:tcPr>
           <w:p>
             <w:r>
@@ -113,7 +90,7 @@
         </w:tc>
         <w:tc>
           <w:tcPr>
-            <w:tcW w:type="dxa" w:w="2160"/>
+            <w:tcW w:w="2160" w:type="dxa"/>
           </w:tcPr>
           <w:p>
             <w:r>
@@ -127,7 +104,7 @@
         </w:tc>
         <w:tc>
           <w:tcPr>
-            <w:tcW w:type="dxa" w:w="2160"/>
+            <w:tcW w:w="2160" w:type="dxa"/>
           </w:tcPr>
           <w:p>
             <w:r>
@@ -141,7 +118,7 @@
         </w:tc>
         <w:tc>
           <w:tcPr>
-            <w:tcW w:type="dxa" w:w="2160"/>
+            <w:tcW w:w="2160" w:type="dxa"/>
           </w:tcPr>
           <w:p>
             <w:r>
@@ -157,12 +134,11 @@
       <w:tr>
         <w:tc>
           <w:tcPr>
-            <w:tcW w:type="dxa" w:w="2160"/>
+            <w:tcW w:w="2160" w:type="dxa"/>
           </w:tcPr>
           <w:p>
             <w:r>
               <w:rPr>
-                <w:b w:val="0"/>
                 <w:sz w:val="18"/>
               </w:rPr>
               <w:t>512</w:t>
@@ -171,12 +147,11 @@
         </w:tc>
         <w:tc>
           <w:tcPr>
-            <w:tcW w:type="dxa" w:w="2160"/>
+            <w:tcW w:w="2160" w:type="dxa"/>
           </w:tcPr>
           <w:p>
             <w:r>
               <w:rPr>
-                <w:b w:val="0"/>
                 <w:sz w:val="18"/>
               </w:rPr>
               <w:t>508 byte</w:t>
@@ -185,12 +160,11 @@
         </w:tc>
         <w:tc>
           <w:tcPr>
-            <w:tcW w:type="dxa" w:w="2160"/>
+            <w:tcW w:w="2160" w:type="dxa"/>
           </w:tcPr>
           <w:p>
             <w:r>
               <w:rPr>
-                <w:b w:val="0"/>
                 <w:sz w:val="18"/>
               </w:rPr>
               <w:t>22</w:t>
@@ -199,12 +173,11 @@
         </w:tc>
         <w:tc>
           <w:tcPr>
-            <w:tcW w:type="dxa" w:w="2160"/>
+            <w:tcW w:w="2160" w:type="dxa"/>
           </w:tcPr>
           <w:p>
             <w:r>
               <w:rPr>
-                <w:b w:val="0"/>
                 <w:sz w:val="18"/>
               </w:rPr>
               <w:t>START + 22 + END = 24</w:t>
@@ -215,12 +188,11 @@
       <w:tr>
         <w:tc>
           <w:tcPr>
-            <w:tcW w:type="dxa" w:w="2160"/>
+            <w:tcW w:w="2160" w:type="dxa"/>
           </w:tcPr>
           <w:p>
             <w:r>
               <w:rPr>
-                <w:b w:val="0"/>
                 <w:sz w:val="18"/>
               </w:rPr>
               <w:t>23 (default)</w:t>
@@ -229,12 +201,11 @@
         </w:tc>
         <w:tc>
           <w:tcPr>
-            <w:tcW w:type="dxa" w:w="2160"/>
+            <w:tcW w:w="2160" w:type="dxa"/>
           </w:tcPr>
           <w:p>
             <w:r>
               <w:rPr>
-                <w:b w:val="0"/>
                 <w:sz w:val="18"/>
               </w:rPr>
               <w:t>19 byte</w:t>
@@ -243,12 +214,11 @@
         </w:tc>
         <w:tc>
           <w:tcPr>
-            <w:tcW w:type="dxa" w:w="2160"/>
+            <w:tcW w:w="2160" w:type="dxa"/>
           </w:tcPr>
           <w:p>
             <w:r>
               <w:rPr>
-                <w:b w:val="0"/>
                 <w:sz w:val="18"/>
               </w:rPr>
               <w:t>565</w:t>
@@ -257,12 +227,11 @@
         </w:tc>
         <w:tc>
           <w:tcPr>
-            <w:tcW w:type="dxa" w:w="2160"/>
+            <w:tcW w:w="2160" w:type="dxa"/>
           </w:tcPr>
           <w:p>
             <w:r>
               <w:rPr>
-                <w:b w:val="0"/>
                 <w:sz w:val="18"/>
               </w:rPr>
               <w:t>START + 565 + END = 567</w:t>
@@ -276,10 +245,58 @@
         <w:jc w:val="both"/>
       </w:pPr>
       <w:r>
+        <w:t>Pada kedua kasus, data yang diterima sama persis (228 record). MTU hanya memengaruhi kecepatan, bukan kelengkapan data. Ringkasan alur negosiasi MTU ditunjukkan pada Gambar 1.</w:t>
+      </w:r>
+    </w:p>
+    <w:p>
+      <w:pPr>
+        <w:jc w:val="center"/>
+      </w:pPr>
+      <w:r>
+        <w:drawing>
+          <wp:inline xmlns:a="http://schemas.openxmlformats.org/drawingml/2006/main" xmlns:pic="http://schemas.openxmlformats.org/drawingml/2006/picture">
+            <wp:extent cx="3931920" cy="3657733"/>
+            <wp:docPr id="3" name="Picture 3"/>
+            <wp:cNvGraphicFramePr>
+              <a:graphicFrameLocks noChangeAspect="1"/>
+            </wp:cNvGraphicFramePr>
+            <a:graphic>
+              <a:graphicData uri="http://schemas.openxmlformats.org/drawingml/2006/picture">
+                <pic:pic>
+                  <pic:nvPicPr>
+                    <pic:cNvPr id="0" name="fig_mtu.png"/>
+                    <pic:cNvPicPr/>
+                  </pic:nvPicPr>
+                  <pic:blipFill>
+                    <a:blip r:embed="rId10"/>
+                    <a:stretch>
+                      <a:fillRect/>
+                    </a:stretch>
+                  </pic:blipFill>
+                  <pic:spPr>
+                    <a:xfrm>
+                      <a:off x="0" y="0"/>
+                      <a:ext cx="3931920" cy="3657733"/>
+                    </a:xfrm>
+                    <a:prstGeom prst="rect"/>
+                  </pic:spPr>
+                </pic:pic>
+              </a:graphicData>
+            </a:graphic>
+          </wp:inline>
+        </w:drawing>
+      </w:r>
+    </w:p>
+    <w:p>
+      <w:pPr>
+        <w:jc w:val="center"/>
+      </w:pPr>
+      <w:r>
         <w:rPr>
-          <w:b w:val="0"/>
+          <w:i/>
+          <w:sz w:val="18"/>
         </w:rPr>
-        <w:t>Pada kedua kasus, data yang diterima sama persis (228 record). MTU hanya memengaruhi kecepatan, bukan kelengkapan data.</w:t>
+        <w:t>Gambar 1. Negosiasi MTU: ponsel mengusulkan ukuran, watch membalas dengan yang ia dukung, lalu dipakai nilai terkecil. Bila negosiasi gagal, dipakai MTU default 23 byte.</w:t>
       </w:r>
     </w:p>
     <w:p>
@@ -295,7 +312,11 @@
         <w:jc w:val="both"/>
       </w:pPr>
       <w:r>
-        <w:t>Smartphone mengaktifkan notifikasi dengan menuliskan nilai 0x01 0x00 ke deskriptor CCCD pada karakteristik record. Di sisi smartwatch, permintaan ini ditangani lewat callback onDescriptorWriteRequest, dan perangkat smartphone dicatat sebagai pelanggan (subscriber) yang berhak menerima notifikasi. Sejak titik ini, smartwatch dapat mengirim paket data.</w:t>
+        <w:t xml:space="preserve">Smartphone mengaktifkan notifikasi dengan menuliskan nilai 0x01 0x00 ke deskriptor CCCD pada karakteristik record. Di sisi smartwatch, permintaan ini ditangani lewat callback onDescriptorWriteRequest, dan perangkat smartphone dicatat sebagai pelanggan </w:t>
+      </w:r>
+      <w:r>
+        <w:lastRenderedPageBreak/>
+        <w:t>(subscriber) yang berhak menerima notifikasi. Sejak titik ini, smartwatch dapat mengirim paket data.</w:t>
       </w:r>
     </w:p>
     <w:p>
@@ -311,11 +332,7 @@
         <w:jc w:val="both"/>
       </w:pPr>
       <w:r>
-        <w:t xml:space="preserve">Karena satu paket (JSON array berisi banyak pembacaan) berukuran lebih besar daripada kapasitas satu notifikasi BLE, paket dipecah menjadi beberapa frame. Setiap frame diawali satu byte opcode: START (0x01) menandai awal paket, DATA (0x02) membawa potongan JSON sebesar maksimum MTU-4 byte, dan END (0x03) menandai akhir paket. Frame </w:t>
-      </w:r>
-      <w:r>
-        <w:lastRenderedPageBreak/>
-        <w:t>dikirim satu per satu dengan flow control: frame berikutnya baru dikirim setelah sistem mengonfirmasi frame sebelumnya tuntas terkirim (callback onNotificationSent). Smartphone merangkai kembali potongan-potongan tersebut sampai menerima END, lalu men-decode JSON menjadi daftar pembacaan dan menyimpannya ke SQLite dalam satu transaksi.</w:t>
+        <w:t>Karena satu paket (JSON array berisi banyak pembacaan) berukuran lebih besar daripada kapasitas satu notifikasi BLE, paket dipecah menjadi beberapa frame. Setiap frame diawali satu byte opcode: START (0x01) menandai awal paket, DATA (0x02) membawa potongan JSON sebesar maksimum MTU-4 byte, dan END (0x03) menandai akhir paket. Frame dikirim satu per satu dengan flow control: frame berikutnya baru dikirim setelah sistem mengonfirmasi frame sebelumnya tuntas terkirim (callback onNotificationSent). Smartphone merangkai kembali potongan-potongan tersebut sampai menerima END, lalu men-decode JSON menjadi daftar pembacaan dan menyimpannya ke SQLite dalam satu transaksi.</w:t>
       </w:r>
     </w:p>
     <w:p>
@@ -339,39 +356,7 @@
         <w:jc w:val="both"/>
       </w:pPr>
       <w:r>
-        <w:t xml:space="preserve">Setelah seluruh paket tersimpan di smartphone, smartphone menuliskan jumlah record yang berhasil disimpan ke karakteristik ACK (0000a102). Smartwatch baru menandai data tersebut sebagai sudah terkirim (synced = 1) setelah menerima ACK ini. Bila ACK tidak diterima dalam tenggang waktu (30 detik) - misalnya aplikasi penerima berhenti atau koneksi terputus - data tetap berstatus belum terkirim dan akan dikirim ulang pada giliran berikutnya. Mekanisme ini menutup celah "data dianggap terkirim padahal </w:t>
-      </w:r>
-      <w:proofErr w:type="spellStart"/>
-      <w:r>
-        <w:t>penerima</w:t>
-      </w:r>
-      <w:proofErr w:type="spellEnd"/>
-      <w:r>
-        <w:t xml:space="preserve"> </w:t>
-      </w:r>
-      <w:proofErr w:type="spellStart"/>
-      <w:r>
-        <w:t>tidak</w:t>
-      </w:r>
-      <w:proofErr w:type="spellEnd"/>
-      <w:r>
-        <w:t xml:space="preserve"> </w:t>
-      </w:r>
-      <w:proofErr w:type="spellStart"/>
-      <w:r>
-        <w:t>benar-benar</w:t>
-      </w:r>
-      <w:proofErr w:type="spellEnd"/>
-      <w:r>
-        <w:t xml:space="preserve"> </w:t>
-      </w:r>
-      <w:proofErr w:type="spellStart"/>
-      <w:r>
-        <w:t>menerimanya</w:t>
-      </w:r>
-      <w:proofErr w:type="spellEnd"/>
-      <w:r>
-        <w:t>".</w:t>
+        <w:t>Setelah seluruh paket tersimpan di smartphone, smartphone menuliskan jumlah record yang berhasil disimpan ke karakteristik ACK (0000a102). Smartwatch baru menandai data tersebut sebagai sudah terkirim (synced = 1) setelah menerima ACK ini. Bila ACK tidak diterima dalam tenggang waktu (30 detik) - misalnya aplikasi penerima berhenti atau koneksi terputus - data tetap berstatus belum terkirim dan akan dikirim ulang pada giliran berikutnya. Mekanisme ini menutup celah "data dianggap terkirim padahal penerima tidak benar-benar menerimanya".</w:t>
       </w:r>
     </w:p>
     <w:p>
@@ -387,63 +372,7 @@
         <w:jc w:val="both"/>
       </w:pPr>
       <w:r>
-        <w:t xml:space="preserve">Karena pengiriman ulang dapat membuat satu pembacaan terkirim lebih dari sekali, basis data smartphone diberi indeks unik pada kolom waktu (time) dan </w:t>
-      </w:r>
-      <w:proofErr w:type="spellStart"/>
-      <w:r>
-        <w:t>penyimpanan</w:t>
-      </w:r>
-      <w:proofErr w:type="spellEnd"/>
-      <w:r>
-        <w:t xml:space="preserve"> </w:t>
-      </w:r>
-      <w:proofErr w:type="spellStart"/>
-      <w:r>
-        <w:t>dilakukan</w:t>
-      </w:r>
-      <w:proofErr w:type="spellEnd"/>
-      <w:r>
-        <w:t xml:space="preserve"> </w:t>
-      </w:r>
-      <w:proofErr w:type="spellStart"/>
-      <w:r>
-        <w:t>dengan</w:t>
-      </w:r>
-      <w:proofErr w:type="spellEnd"/>
-      <w:r>
-        <w:t xml:space="preserve"> mode </w:t>
-      </w:r>
-      <w:proofErr w:type="spellStart"/>
-      <w:r>
-        <w:t>abaikan</w:t>
-      </w:r>
-      <w:proofErr w:type="spellEnd"/>
-      <w:r>
-        <w:t xml:space="preserve"> </w:t>
-      </w:r>
-      <w:proofErr w:type="spellStart"/>
-      <w:r>
-        <w:t>bila</w:t>
-      </w:r>
-      <w:proofErr w:type="spellEnd"/>
-      <w:r>
-        <w:t xml:space="preserve"> </w:t>
-      </w:r>
-      <w:proofErr w:type="spellStart"/>
-      <w:r>
-        <w:t>sudah</w:t>
-      </w:r>
-      <w:proofErr w:type="spellEnd"/>
-      <w:r>
-        <w:t xml:space="preserve"> </w:t>
-      </w:r>
-      <w:proofErr w:type="spellStart"/>
-      <w:r>
-        <w:t>ada</w:t>
-      </w:r>
-      <w:proofErr w:type="spellEnd"/>
-      <w:r>
-        <w:t xml:space="preserve"> (INSERT OR IGNORE). Dengan begitu, pengiriman ulang tidak menghasilkan baris ganda dan jumlah duplikat pada hasil ekspor tetap nol. Pencocokan antara data smartwatch dan smartphone tetap memakai kolom time (Unix epoch yang dibuat di smartwatch), sehingga perhitungan tidak bergantung pada sinkronisasi jam kedua perangkat.</w:t>
+        <w:t>Karena pengiriman ulang dapat membuat satu pembacaan terkirim lebih dari sekali, basis data smartphone diberi indeks unik pada kolom waktu (time) dan penyimpanan dilakukan dengan mode abaikan bila sudah ada (INSERT OR IGNORE). Dengan begitu, pengiriman ulang tidak menghasilkan baris ganda dan jumlah duplikat pada hasil ekspor tetap nol. Pencocokan antara data smartwatch dan smartphone tetap memakai kolom time (Unix epoch yang dibuat di smartwatch), sehingga perhitungan tidak bergantung pada sinkronisasi jam kedua perangkat.</w:t>
       </w:r>
     </w:p>
     <w:p>
@@ -469,6 +398,7 @@
           <w:rFonts w:ascii="Consolas" w:hAnsi="Consolas"/>
           <w:sz w:val="18"/>
         </w:rPr>
+        <w:lastRenderedPageBreak/>
         <w:t xml:space="preserve"> {"bpm": 79, "accuracy": 3, "time": 1750636801124}, ... ]</w:t>
       </w:r>
     </w:p>
@@ -480,7 +410,6 @@
         <w:rPr>
           <w:noProof/>
         </w:rPr>
-        <w:lastRenderedPageBreak/>
         <w:drawing>
           <wp:inline distT="0" distB="0" distL="0" distR="0" wp14:anchorId="45958605" wp14:editId="258481DA">
             <wp:extent cx="3839845" cy="6038603"/>
@@ -540,87 +469,7 @@
           <w:i/>
           <w:sz w:val="18"/>
         </w:rPr>
-        <w:t xml:space="preserve">Gambar 1. Jalur komunikasi GATT lengkap: tabel atribut, penyiapan koneksi, berlangganan (CCCD), transfer berbingkai dengan flow control, dan </w:t>
-      </w:r>
-      <w:proofErr w:type="spellStart"/>
-      <w:r>
-        <w:rPr>
-          <w:i/>
-          <w:sz w:val="18"/>
-        </w:rPr>
-        <w:t>penulisan</w:t>
-      </w:r>
-      <w:proofErr w:type="spellEnd"/>
-      <w:r>
-        <w:rPr>
-          <w:i/>
-          <w:sz w:val="18"/>
-        </w:rPr>
-        <w:t xml:space="preserve"> ACK (</w:t>
-      </w:r>
-      <w:proofErr w:type="spellStart"/>
-      <w:r>
-        <w:rPr>
-          <w:i/>
-          <w:sz w:val="18"/>
-        </w:rPr>
-        <w:t>konfirmasi</w:t>
-      </w:r>
-      <w:proofErr w:type="spellEnd"/>
-      <w:r>
-        <w:rPr>
-          <w:i/>
-          <w:sz w:val="18"/>
-        </w:rPr>
-        <w:t xml:space="preserve"> </w:t>
-      </w:r>
-      <w:proofErr w:type="spellStart"/>
-      <w:r>
-        <w:rPr>
-          <w:i/>
-          <w:sz w:val="18"/>
-        </w:rPr>
-        <w:t>penerimaan</w:t>
-      </w:r>
-      <w:proofErr w:type="spellEnd"/>
-      <w:r>
-        <w:rPr>
-          <w:i/>
-          <w:sz w:val="18"/>
-        </w:rPr>
-        <w:t xml:space="preserve">) </w:t>
-      </w:r>
-      <w:proofErr w:type="spellStart"/>
-      <w:r>
-        <w:rPr>
-          <w:i/>
-          <w:sz w:val="18"/>
-        </w:rPr>
-        <w:t>kembali</w:t>
-      </w:r>
-      <w:proofErr w:type="spellEnd"/>
-      <w:r>
-        <w:rPr>
-          <w:i/>
-          <w:sz w:val="18"/>
-        </w:rPr>
-        <w:t xml:space="preserve"> </w:t>
-      </w:r>
-      <w:proofErr w:type="spellStart"/>
-      <w:r>
-        <w:rPr>
-          <w:i/>
-          <w:sz w:val="18"/>
-        </w:rPr>
-        <w:t>ke</w:t>
-      </w:r>
-      <w:proofErr w:type="spellEnd"/>
-      <w:r>
-        <w:rPr>
-          <w:i/>
-          <w:sz w:val="18"/>
-        </w:rPr>
-        <w:t xml:space="preserve"> smartwatch.</w:t>
+        <w:t>Gambar 2. Jalur komunikasi GATT lengkap: tabel atribut, penyiapan koneksi, berlangganan (CCCD), transfer berbingkai dengan flow control, dan penulisan ACK (konfirmasi penerimaan) kembali ke smartwatch.</w:t>
       </w:r>
     </w:p>
     <w:p>
@@ -636,537 +485,24 @@
         </w:rPr>
         <w:t xml:space="preserve">Gambar </w:t>
       </w:r>
-      <w:proofErr w:type="spellStart"/>
       <w:r>
         <w:rPr>
           <w:iCs/>
         </w:rPr>
-        <w:t>diatas</w:t>
+        <w:t xml:space="preserve">diatas </w:t>
       </w:r>
-      <w:proofErr w:type="spellEnd"/>
       <w:r>
         <w:rPr>
           <w:iCs/>
         </w:rPr>
-        <w:t xml:space="preserve"> </w:t>
+        <w:t xml:space="preserve">menyajikan keseluruhan jalur komunikasi Generic Attribute Profile (GATT) berbasis Bluetooth Low Energy (BLE) antara smartwatch yang berperan sebagai peripheral/GATT server dan smartphone sebagai central/GATT client. Bagian atas gambar memperlihatkan tabel atribut yang di-host smartwatch: satu layanan utama (Service 0000a100) yang menaungi karakteristik record (0000a101, properti notify, dilengkapi deskriptor CCCD 0x2902) dan karakteristik konfirmasi (0000a102, properti write). Bagian </w:t>
       </w:r>
-      <w:proofErr w:type="spellStart"/>
       <w:r>
         <w:rPr>
           <w:iCs/>
         </w:rPr>
-        <w:t>menyajikan</w:t>
-      </w:r>
-      <w:proofErr w:type="spellEnd"/>
-      <w:r>
-        <w:rPr>
-          <w:iCs/>
-        </w:rPr>
-        <w:t xml:space="preserve"> </w:t>
-      </w:r>
-      <w:proofErr w:type="spellStart"/>
-      <w:r>
-        <w:rPr>
-          <w:iCs/>
-        </w:rPr>
-        <w:t>keseluruhan</w:t>
-      </w:r>
-      <w:proofErr w:type="spellEnd"/>
-      <w:r>
-        <w:rPr>
-          <w:iCs/>
-        </w:rPr>
-        <w:t xml:space="preserve"> </w:t>
-      </w:r>
-      <w:proofErr w:type="spellStart"/>
-      <w:r>
-        <w:rPr>
-          <w:iCs/>
-        </w:rPr>
-        <w:t>jalur</w:t>
-      </w:r>
-      <w:proofErr w:type="spellEnd"/>
-      <w:r>
-        <w:rPr>
-          <w:iCs/>
-        </w:rPr>
-        <w:t xml:space="preserve"> </w:t>
-      </w:r>
-      <w:proofErr w:type="spellStart"/>
-      <w:r>
-        <w:rPr>
-          <w:iCs/>
-        </w:rPr>
-        <w:t>komunikasi</w:t>
-      </w:r>
-      <w:proofErr w:type="spellEnd"/>
-      <w:r>
-        <w:rPr>
-          <w:iCs/>
-        </w:rPr>
-        <w:t xml:space="preserve"> Generic Attribute Profile (GATT) </w:t>
-      </w:r>
-      <w:proofErr w:type="spellStart"/>
-      <w:r>
-        <w:rPr>
-          <w:iCs/>
-        </w:rPr>
-        <w:t>berbasis</w:t>
-      </w:r>
-      <w:proofErr w:type="spellEnd"/>
-      <w:r>
-        <w:rPr>
-          <w:iCs/>
-        </w:rPr>
-        <w:t xml:space="preserve"> Bluetooth Low Energy (BLE) </w:t>
-      </w:r>
-      <w:proofErr w:type="spellStart"/>
-      <w:r>
-        <w:rPr>
-          <w:iCs/>
-        </w:rPr>
-        <w:t>antara</w:t>
-      </w:r>
-      <w:proofErr w:type="spellEnd"/>
-      <w:r>
-        <w:rPr>
-          <w:iCs/>
-        </w:rPr>
-        <w:t xml:space="preserve"> smartwatch yang </w:t>
-      </w:r>
-      <w:proofErr w:type="spellStart"/>
-      <w:r>
-        <w:rPr>
-          <w:iCs/>
-        </w:rPr>
-        <w:t>berperan</w:t>
-      </w:r>
-      <w:proofErr w:type="spellEnd"/>
-      <w:r>
-        <w:rPr>
-          <w:iCs/>
-        </w:rPr>
-        <w:t xml:space="preserve"> </w:t>
-      </w:r>
-      <w:proofErr w:type="spellStart"/>
-      <w:r>
-        <w:rPr>
-          <w:iCs/>
-        </w:rPr>
-        <w:t>sebagai</w:t>
-      </w:r>
-      <w:proofErr w:type="spellEnd"/>
-      <w:r>
-        <w:rPr>
-          <w:iCs/>
-        </w:rPr>
-        <w:t xml:space="preserve"> peripheral/GATT server dan smartphone </w:t>
-      </w:r>
-      <w:proofErr w:type="spellStart"/>
-      <w:r>
-        <w:rPr>
-          <w:iCs/>
-        </w:rPr>
-        <w:t>sebagai</w:t>
-      </w:r>
-      <w:proofErr w:type="spellEnd"/>
-      <w:r>
-        <w:rPr>
-          <w:iCs/>
-        </w:rPr>
-        <w:t xml:space="preserve"> central/GATT client. Bagian </w:t>
-      </w:r>
-      <w:proofErr w:type="spellStart"/>
-      <w:r>
-        <w:rPr>
-          <w:iCs/>
-        </w:rPr>
-        <w:t>atas</w:t>
-      </w:r>
-      <w:proofErr w:type="spellEnd"/>
-      <w:r>
-        <w:rPr>
-          <w:iCs/>
-        </w:rPr>
-        <w:t xml:space="preserve"> </w:t>
-      </w:r>
-      <w:proofErr w:type="spellStart"/>
-      <w:r>
-        <w:rPr>
-          <w:iCs/>
-        </w:rPr>
-        <w:t>gambar</w:t>
-      </w:r>
-      <w:proofErr w:type="spellEnd"/>
-      <w:r>
-        <w:rPr>
-          <w:iCs/>
-        </w:rPr>
-        <w:t xml:space="preserve"> </w:t>
-      </w:r>
-      <w:proofErr w:type="spellStart"/>
-      <w:r>
-        <w:rPr>
-          <w:iCs/>
-        </w:rPr>
-        <w:t>memperlihatkan</w:t>
-      </w:r>
-      <w:proofErr w:type="spellEnd"/>
-      <w:r>
-        <w:rPr>
-          <w:iCs/>
-        </w:rPr>
-        <w:t xml:space="preserve"> </w:t>
-      </w:r>
-      <w:proofErr w:type="spellStart"/>
-      <w:r>
-        <w:rPr>
-          <w:iCs/>
-        </w:rPr>
-        <w:t>tabel</w:t>
-      </w:r>
-      <w:proofErr w:type="spellEnd"/>
-      <w:r>
-        <w:rPr>
-          <w:iCs/>
-        </w:rPr>
-        <w:t xml:space="preserve"> </w:t>
-      </w:r>
-      <w:proofErr w:type="spellStart"/>
-      <w:r>
-        <w:rPr>
-          <w:iCs/>
-        </w:rPr>
-        <w:t>atribut</w:t>
-      </w:r>
-      <w:proofErr w:type="spellEnd"/>
-      <w:r>
-        <w:rPr>
-          <w:iCs/>
-        </w:rPr>
-        <w:t xml:space="preserve"> yang di-host smartwatch: </w:t>
-      </w:r>
-      <w:proofErr w:type="spellStart"/>
-      <w:r>
-        <w:rPr>
-          <w:iCs/>
-        </w:rPr>
-        <w:t>satu</w:t>
-      </w:r>
-      <w:proofErr w:type="spellEnd"/>
-      <w:r>
-        <w:rPr>
-          <w:iCs/>
-        </w:rPr>
-        <w:t xml:space="preserve"> </w:t>
-      </w:r>
-      <w:proofErr w:type="spellStart"/>
-      <w:r>
-        <w:rPr>
-          <w:iCs/>
-        </w:rPr>
-        <w:t>layanan</w:t>
-      </w:r>
-      <w:proofErr w:type="spellEnd"/>
-      <w:r>
-        <w:rPr>
-          <w:iCs/>
-        </w:rPr>
-        <w:t xml:space="preserve"> </w:t>
-      </w:r>
-      <w:proofErr w:type="spellStart"/>
-      <w:r>
-        <w:rPr>
-          <w:iCs/>
-        </w:rPr>
-        <w:t>utama</w:t>
-      </w:r>
-      <w:proofErr w:type="spellEnd"/>
-      <w:r>
-        <w:rPr>
-          <w:iCs/>
-        </w:rPr>
-        <w:t xml:space="preserve"> (Service 0000a100) yang </w:t>
-      </w:r>
-      <w:proofErr w:type="spellStart"/>
-      <w:r>
-        <w:rPr>
-          <w:iCs/>
-        </w:rPr>
-        <w:t>menaungi</w:t>
-      </w:r>
-      <w:proofErr w:type="spellEnd"/>
-      <w:r>
-        <w:rPr>
-          <w:iCs/>
-        </w:rPr>
-        <w:t xml:space="preserve"> </w:t>
-      </w:r>
-      <w:proofErr w:type="spellStart"/>
-      <w:r>
-        <w:rPr>
-          <w:iCs/>
-        </w:rPr>
-        <w:t>karakteristik</w:t>
-      </w:r>
-      <w:proofErr w:type="spellEnd"/>
-      <w:r>
-        <w:rPr>
-          <w:iCs/>
-        </w:rPr>
-        <w:t xml:space="preserve"> record (0000a101, </w:t>
-      </w:r>
-      <w:proofErr w:type="spellStart"/>
-      <w:r>
-        <w:rPr>
-          <w:iCs/>
-        </w:rPr>
-        <w:t>properti</w:t>
-      </w:r>
-      <w:proofErr w:type="spellEnd"/>
-      <w:r>
-        <w:rPr>
-          <w:iCs/>
-        </w:rPr>
-        <w:t xml:space="preserve"> notify, </w:t>
-      </w:r>
-      <w:proofErr w:type="spellStart"/>
-      <w:r>
-        <w:rPr>
-          <w:iCs/>
-        </w:rPr>
-        <w:t>dilengkapi</w:t>
-      </w:r>
-      <w:proofErr w:type="spellEnd"/>
-      <w:r>
-        <w:rPr>
-          <w:iCs/>
-        </w:rPr>
-        <w:t xml:space="preserve"> </w:t>
-      </w:r>
-      <w:proofErr w:type="spellStart"/>
-      <w:r>
-        <w:rPr>
-          <w:iCs/>
-        </w:rPr>
-        <w:t>deskriptor</w:t>
-      </w:r>
-      <w:proofErr w:type="spellEnd"/>
-      <w:r>
-        <w:rPr>
-          <w:iCs/>
-        </w:rPr>
-        <w:t xml:space="preserve"> CCCD 0x2902) dan </w:t>
-      </w:r>
-      <w:proofErr w:type="spellStart"/>
-      <w:r>
-        <w:rPr>
-          <w:iCs/>
-        </w:rPr>
-        <w:t>karakteristik</w:t>
-      </w:r>
-      <w:proofErr w:type="spellEnd"/>
-      <w:r>
-        <w:rPr>
-          <w:iCs/>
-        </w:rPr>
-        <w:t xml:space="preserve"> </w:t>
-      </w:r>
-      <w:proofErr w:type="spellStart"/>
-      <w:r>
-        <w:rPr>
-          <w:iCs/>
-        </w:rPr>
-        <w:t>konfirmasi</w:t>
-      </w:r>
-      <w:proofErr w:type="spellEnd"/>
-      <w:r>
-        <w:rPr>
-          <w:iCs/>
-        </w:rPr>
-        <w:t xml:space="preserve"> (0000a102, </w:t>
-      </w:r>
-      <w:proofErr w:type="spellStart"/>
-      <w:r>
-        <w:rPr>
-          <w:iCs/>
-        </w:rPr>
-        <w:t>properti</w:t>
-      </w:r>
-      <w:proofErr w:type="spellEnd"/>
-      <w:r>
-        <w:rPr>
-          <w:iCs/>
-        </w:rPr>
-        <w:t xml:space="preserve"> write). Bagian </w:t>
-      </w:r>
-      <w:proofErr w:type="spellStart"/>
-      <w:r>
-        <w:rPr>
-          <w:iCs/>
-        </w:rPr>
-        <w:t>bawah</w:t>
-      </w:r>
-      <w:proofErr w:type="spellEnd"/>
-      <w:r>
-        <w:rPr>
-          <w:iCs/>
-        </w:rPr>
-        <w:t xml:space="preserve"> </w:t>
-      </w:r>
-      <w:proofErr w:type="spellStart"/>
-      <w:r>
-        <w:rPr>
-          <w:iCs/>
-        </w:rPr>
-        <w:t>memperlihatkan</w:t>
-      </w:r>
-      <w:proofErr w:type="spellEnd"/>
-      <w:r>
-        <w:rPr>
-          <w:iCs/>
-        </w:rPr>
-        <w:t xml:space="preserve"> </w:t>
-      </w:r>
-      <w:proofErr w:type="spellStart"/>
-      <w:r>
-        <w:rPr>
-          <w:iCs/>
-        </w:rPr>
-        <w:t>urutan</w:t>
-      </w:r>
-      <w:proofErr w:type="spellEnd"/>
-      <w:r>
-        <w:rPr>
-          <w:iCs/>
-        </w:rPr>
-        <w:t xml:space="preserve"> </w:t>
-      </w:r>
-      <w:proofErr w:type="spellStart"/>
-      <w:r>
-        <w:rPr>
-          <w:iCs/>
-        </w:rPr>
-        <w:t>pertukaran</w:t>
-      </w:r>
-      <w:proofErr w:type="spellEnd"/>
-      <w:r>
-        <w:rPr>
-          <w:iCs/>
-        </w:rPr>
-        <w:t xml:space="preserve"> </w:t>
-      </w:r>
-      <w:proofErr w:type="spellStart"/>
-      <w:r>
-        <w:rPr>
-          <w:iCs/>
-        </w:rPr>
-        <w:t>pesan</w:t>
-      </w:r>
-      <w:proofErr w:type="spellEnd"/>
-      <w:r>
-        <w:rPr>
-          <w:iCs/>
-        </w:rPr>
-        <w:t xml:space="preserve"> </w:t>
-      </w:r>
-      <w:proofErr w:type="spellStart"/>
-      <w:r>
-        <w:rPr>
-          <w:iCs/>
-        </w:rPr>
-        <w:t>antarperangkat</w:t>
-      </w:r>
-      <w:proofErr w:type="spellEnd"/>
-      <w:r>
-        <w:rPr>
-          <w:iCs/>
-        </w:rPr>
-        <w:t xml:space="preserve"> </w:t>
-      </w:r>
-      <w:proofErr w:type="spellStart"/>
-      <w:r>
-        <w:rPr>
-          <w:iCs/>
-        </w:rPr>
-        <w:t>sepanjang</w:t>
-      </w:r>
-      <w:proofErr w:type="spellEnd"/>
-      <w:r>
-        <w:rPr>
-          <w:iCs/>
-        </w:rPr>
-        <w:t xml:space="preserve"> </w:t>
-      </w:r>
-      <w:proofErr w:type="spellStart"/>
-      <w:r>
-        <w:rPr>
-          <w:iCs/>
-        </w:rPr>
-        <w:t>waktu</w:t>
-      </w:r>
-      <w:proofErr w:type="spellEnd"/>
-      <w:r>
-        <w:rPr>
-          <w:iCs/>
-        </w:rPr>
-        <w:t xml:space="preserve">, yang </w:t>
-      </w:r>
-      <w:proofErr w:type="spellStart"/>
-      <w:r>
-        <w:rPr>
-          <w:iCs/>
-        </w:rPr>
-        <w:t>dikelompokkan</w:t>
-      </w:r>
-      <w:proofErr w:type="spellEnd"/>
-      <w:r>
-        <w:rPr>
-          <w:iCs/>
-        </w:rPr>
-        <w:t xml:space="preserve"> </w:t>
-      </w:r>
-      <w:proofErr w:type="spellStart"/>
-      <w:r>
-        <w:rPr>
-          <w:iCs/>
-        </w:rPr>
-        <w:t>ke</w:t>
-      </w:r>
-      <w:proofErr w:type="spellEnd"/>
-      <w:r>
-        <w:rPr>
-          <w:iCs/>
-        </w:rPr>
-        <w:t xml:space="preserve"> </w:t>
-      </w:r>
-      <w:proofErr w:type="spellStart"/>
-      <w:r>
-        <w:rPr>
-          <w:iCs/>
-        </w:rPr>
-        <w:t>dalam</w:t>
-      </w:r>
-      <w:proofErr w:type="spellEnd"/>
-      <w:r>
-        <w:rPr>
-          <w:iCs/>
-        </w:rPr>
-        <w:t xml:space="preserve"> lima </w:t>
-      </w:r>
-      <w:proofErr w:type="spellStart"/>
-      <w:r>
-        <w:rPr>
-          <w:iCs/>
-        </w:rPr>
-        <w:t>fase</w:t>
-      </w:r>
-      <w:proofErr w:type="spellEnd"/>
-      <w:r>
-        <w:rPr>
-          <w:iCs/>
-        </w:rPr>
-        <w:t>.</w:t>
+        <w:lastRenderedPageBreak/>
+        <w:t>bawah memperlihatkan urutan pertukaran pesan antarperangkat sepanjang waktu, yang dikelompokkan ke dalam lima fase.</w:t>
       </w:r>
     </w:p>
     <w:p>
@@ -1188,1253 +524,7 @@
         <w:rPr>
           <w:iCs/>
         </w:rPr>
-        <w:t xml:space="preserve">Pada </w:t>
-      </w:r>
-      <w:proofErr w:type="spellStart"/>
-      <w:r>
-        <w:rPr>
-          <w:iCs/>
-        </w:rPr>
-        <w:t>fase</w:t>
-      </w:r>
-      <w:proofErr w:type="spellEnd"/>
-      <w:r>
-        <w:rPr>
-          <w:iCs/>
-        </w:rPr>
-        <w:t xml:space="preserve"> Setup, smartwatch </w:t>
-      </w:r>
-      <w:proofErr w:type="spellStart"/>
-      <w:r>
-        <w:rPr>
-          <w:iCs/>
-        </w:rPr>
-        <w:t>membuka</w:t>
-      </w:r>
-      <w:proofErr w:type="spellEnd"/>
-      <w:r>
-        <w:rPr>
-          <w:iCs/>
-        </w:rPr>
-        <w:t xml:space="preserve"> GATT server, </w:t>
-      </w:r>
-      <w:proofErr w:type="spellStart"/>
-      <w:r>
-        <w:rPr>
-          <w:iCs/>
-        </w:rPr>
-        <w:t>mendaftarkan</w:t>
-      </w:r>
-      <w:proofErr w:type="spellEnd"/>
-      <w:r>
-        <w:rPr>
-          <w:iCs/>
-        </w:rPr>
-        <w:t xml:space="preserve"> </w:t>
-      </w:r>
-      <w:proofErr w:type="spellStart"/>
-      <w:r>
-        <w:rPr>
-          <w:iCs/>
-        </w:rPr>
-        <w:t>layanan</w:t>
-      </w:r>
-      <w:proofErr w:type="spellEnd"/>
-      <w:r>
-        <w:rPr>
-          <w:iCs/>
-        </w:rPr>
-        <w:t xml:space="preserve"> </w:t>
-      </w:r>
-      <w:proofErr w:type="spellStart"/>
-      <w:r>
-        <w:rPr>
-          <w:iCs/>
-        </w:rPr>
-        <w:t>beserta</w:t>
-      </w:r>
-      <w:proofErr w:type="spellEnd"/>
-      <w:r>
-        <w:rPr>
-          <w:iCs/>
-        </w:rPr>
-        <w:t xml:space="preserve"> </w:t>
-      </w:r>
-      <w:proofErr w:type="spellStart"/>
-      <w:r>
-        <w:rPr>
-          <w:iCs/>
-        </w:rPr>
-        <w:t>karakteristiknya</w:t>
-      </w:r>
-      <w:proofErr w:type="spellEnd"/>
-      <w:r>
-        <w:rPr>
-          <w:iCs/>
-        </w:rPr>
-        <w:t xml:space="preserve">, </w:t>
-      </w:r>
-      <w:proofErr w:type="spellStart"/>
-      <w:r>
-        <w:rPr>
-          <w:iCs/>
-        </w:rPr>
-        <w:t>lalu</w:t>
-      </w:r>
-      <w:proofErr w:type="spellEnd"/>
-      <w:r>
-        <w:rPr>
-          <w:iCs/>
-        </w:rPr>
-        <w:t xml:space="preserve"> </w:t>
-      </w:r>
-      <w:proofErr w:type="spellStart"/>
-      <w:r>
-        <w:rPr>
-          <w:iCs/>
-        </w:rPr>
-        <w:t>memancarkan</w:t>
-      </w:r>
-      <w:proofErr w:type="spellEnd"/>
-      <w:r>
-        <w:rPr>
-          <w:iCs/>
-        </w:rPr>
-        <w:t xml:space="preserve"> </w:t>
-      </w:r>
-      <w:proofErr w:type="spellStart"/>
-      <w:r>
-        <w:rPr>
-          <w:iCs/>
-        </w:rPr>
-        <w:t>iklan</w:t>
-      </w:r>
-      <w:proofErr w:type="spellEnd"/>
-      <w:r>
-        <w:rPr>
-          <w:iCs/>
-        </w:rPr>
-        <w:t xml:space="preserve"> (advertising) </w:t>
-      </w:r>
-      <w:proofErr w:type="spellStart"/>
-      <w:r>
-        <w:rPr>
-          <w:iCs/>
-        </w:rPr>
-        <w:t>berisi</w:t>
-      </w:r>
-      <w:proofErr w:type="spellEnd"/>
-      <w:r>
-        <w:rPr>
-          <w:iCs/>
-        </w:rPr>
-        <w:t xml:space="preserve"> UUID </w:t>
-      </w:r>
-      <w:proofErr w:type="spellStart"/>
-      <w:r>
-        <w:rPr>
-          <w:iCs/>
-        </w:rPr>
-        <w:t>layanan</w:t>
-      </w:r>
-      <w:proofErr w:type="spellEnd"/>
-      <w:r>
-        <w:rPr>
-          <w:iCs/>
-        </w:rPr>
-        <w:t xml:space="preserve">. Pada </w:t>
-      </w:r>
-      <w:proofErr w:type="spellStart"/>
-      <w:r>
-        <w:rPr>
-          <w:iCs/>
-        </w:rPr>
-        <w:t>fase</w:t>
-      </w:r>
-      <w:proofErr w:type="spellEnd"/>
-      <w:r>
-        <w:rPr>
-          <w:iCs/>
-        </w:rPr>
-        <w:t xml:space="preserve"> Connect &amp; discover, smartphone </w:t>
-      </w:r>
-      <w:proofErr w:type="spellStart"/>
-      <w:r>
-        <w:rPr>
-          <w:iCs/>
-        </w:rPr>
-        <w:t>memindai</w:t>
-      </w:r>
-      <w:proofErr w:type="spellEnd"/>
-      <w:r>
-        <w:rPr>
-          <w:iCs/>
-        </w:rPr>
-        <w:t xml:space="preserve">, </w:t>
-      </w:r>
-      <w:proofErr w:type="spellStart"/>
-      <w:r>
-        <w:rPr>
-          <w:iCs/>
-        </w:rPr>
-        <w:t>membangun</w:t>
-      </w:r>
-      <w:proofErr w:type="spellEnd"/>
-      <w:r>
-        <w:rPr>
-          <w:iCs/>
-        </w:rPr>
-        <w:t xml:space="preserve"> </w:t>
-      </w:r>
-      <w:proofErr w:type="spellStart"/>
-      <w:r>
-        <w:rPr>
-          <w:iCs/>
-        </w:rPr>
-        <w:t>koneksi</w:t>
-      </w:r>
-      <w:proofErr w:type="spellEnd"/>
-      <w:r>
-        <w:rPr>
-          <w:iCs/>
-        </w:rPr>
-        <w:t xml:space="preserve">, </w:t>
-      </w:r>
-      <w:proofErr w:type="spellStart"/>
-      <w:r>
-        <w:rPr>
-          <w:iCs/>
-        </w:rPr>
-        <w:t>menegosiasikan</w:t>
-      </w:r>
-      <w:proofErr w:type="spellEnd"/>
-      <w:r>
-        <w:rPr>
-          <w:iCs/>
-        </w:rPr>
-        <w:t xml:space="preserve"> MTU (</w:t>
-      </w:r>
-      <w:proofErr w:type="spellStart"/>
-      <w:r>
-        <w:rPr>
-          <w:iCs/>
-        </w:rPr>
-        <w:t>hingga</w:t>
-      </w:r>
-      <w:proofErr w:type="spellEnd"/>
-      <w:r>
-        <w:rPr>
-          <w:iCs/>
-        </w:rPr>
-        <w:t xml:space="preserve"> 512 byte), dan </w:t>
-      </w:r>
-      <w:proofErr w:type="spellStart"/>
-      <w:r>
-        <w:rPr>
-          <w:iCs/>
-        </w:rPr>
-        <w:t>menelusuri</w:t>
-      </w:r>
-      <w:proofErr w:type="spellEnd"/>
-      <w:r>
-        <w:rPr>
-          <w:iCs/>
-        </w:rPr>
-        <w:t xml:space="preserve"> </w:t>
-      </w:r>
-      <w:proofErr w:type="spellStart"/>
-      <w:r>
-        <w:rPr>
-          <w:iCs/>
-        </w:rPr>
-        <w:t>layanan</w:t>
-      </w:r>
-      <w:proofErr w:type="spellEnd"/>
-      <w:r>
-        <w:rPr>
-          <w:iCs/>
-        </w:rPr>
-        <w:t xml:space="preserve"> </w:t>
-      </w:r>
-      <w:proofErr w:type="spellStart"/>
-      <w:r>
-        <w:rPr>
-          <w:iCs/>
-        </w:rPr>
-        <w:t>untuk</w:t>
-      </w:r>
-      <w:proofErr w:type="spellEnd"/>
-      <w:r>
-        <w:rPr>
-          <w:iCs/>
-        </w:rPr>
-        <w:t xml:space="preserve"> </w:t>
-      </w:r>
-      <w:proofErr w:type="spellStart"/>
-      <w:r>
-        <w:rPr>
-          <w:iCs/>
-        </w:rPr>
-        <w:t>menemukan</w:t>
-      </w:r>
-      <w:proofErr w:type="spellEnd"/>
-      <w:r>
-        <w:rPr>
-          <w:iCs/>
-        </w:rPr>
-        <w:t xml:space="preserve"> </w:t>
-      </w:r>
-      <w:proofErr w:type="spellStart"/>
-      <w:r>
-        <w:rPr>
-          <w:iCs/>
-        </w:rPr>
-        <w:t>karakteristik</w:t>
-      </w:r>
-      <w:proofErr w:type="spellEnd"/>
-      <w:r>
-        <w:rPr>
-          <w:iCs/>
-        </w:rPr>
-        <w:t xml:space="preserve"> yang </w:t>
-      </w:r>
-      <w:proofErr w:type="spellStart"/>
-      <w:r>
-        <w:rPr>
-          <w:iCs/>
-        </w:rPr>
-        <w:t>dibutuhkan</w:t>
-      </w:r>
-      <w:proofErr w:type="spellEnd"/>
-      <w:r>
-        <w:rPr>
-          <w:iCs/>
-        </w:rPr>
-        <w:t xml:space="preserve">. Pada </w:t>
-      </w:r>
-      <w:proofErr w:type="spellStart"/>
-      <w:r>
-        <w:rPr>
-          <w:iCs/>
-        </w:rPr>
-        <w:t>fase</w:t>
-      </w:r>
-      <w:proofErr w:type="spellEnd"/>
-      <w:r>
-        <w:rPr>
-          <w:iCs/>
-        </w:rPr>
-        <w:t xml:space="preserve"> Subscribe, smartphone </w:t>
-      </w:r>
-      <w:proofErr w:type="spellStart"/>
-      <w:r>
-        <w:rPr>
-          <w:iCs/>
-        </w:rPr>
-        <w:t>mengaktifkan</w:t>
-      </w:r>
-      <w:proofErr w:type="spellEnd"/>
-      <w:r>
-        <w:rPr>
-          <w:iCs/>
-        </w:rPr>
-        <w:t xml:space="preserve"> </w:t>
-      </w:r>
-      <w:proofErr w:type="spellStart"/>
-      <w:r>
-        <w:rPr>
-          <w:iCs/>
-        </w:rPr>
-        <w:t>notifikasi</w:t>
-      </w:r>
-      <w:proofErr w:type="spellEnd"/>
-      <w:r>
-        <w:rPr>
-          <w:iCs/>
-        </w:rPr>
-        <w:t xml:space="preserve"> </w:t>
-      </w:r>
-      <w:proofErr w:type="spellStart"/>
-      <w:r>
-        <w:rPr>
-          <w:iCs/>
-        </w:rPr>
-        <w:t>dengan</w:t>
-      </w:r>
-      <w:proofErr w:type="spellEnd"/>
-      <w:r>
-        <w:rPr>
-          <w:iCs/>
-        </w:rPr>
-        <w:t xml:space="preserve"> </w:t>
-      </w:r>
-      <w:proofErr w:type="spellStart"/>
-      <w:r>
-        <w:rPr>
-          <w:iCs/>
-        </w:rPr>
-        <w:t>menulis</w:t>
-      </w:r>
-      <w:proofErr w:type="spellEnd"/>
-      <w:r>
-        <w:rPr>
-          <w:iCs/>
-        </w:rPr>
-        <w:t xml:space="preserve"> </w:t>
-      </w:r>
-      <w:proofErr w:type="spellStart"/>
-      <w:r>
-        <w:rPr>
-          <w:iCs/>
-        </w:rPr>
-        <w:t>nilai</w:t>
-      </w:r>
-      <w:proofErr w:type="spellEnd"/>
-      <w:r>
-        <w:rPr>
-          <w:iCs/>
-        </w:rPr>
-        <w:t xml:space="preserve"> 0x01 0x00 </w:t>
-      </w:r>
-      <w:proofErr w:type="spellStart"/>
-      <w:r>
-        <w:rPr>
-          <w:iCs/>
-        </w:rPr>
-        <w:t>ke</w:t>
-      </w:r>
-      <w:proofErr w:type="spellEnd"/>
-      <w:r>
-        <w:rPr>
-          <w:iCs/>
-        </w:rPr>
-        <w:t xml:space="preserve"> </w:t>
-      </w:r>
-      <w:proofErr w:type="spellStart"/>
-      <w:r>
-        <w:rPr>
-          <w:iCs/>
-        </w:rPr>
-        <w:t>deskriptor</w:t>
-      </w:r>
-      <w:proofErr w:type="spellEnd"/>
-      <w:r>
-        <w:rPr>
-          <w:iCs/>
-        </w:rPr>
-        <w:t xml:space="preserve"> CCCD, yang </w:t>
-      </w:r>
-      <w:proofErr w:type="spellStart"/>
-      <w:r>
-        <w:rPr>
-          <w:iCs/>
-        </w:rPr>
-        <w:t>kemudian</w:t>
-      </w:r>
-      <w:proofErr w:type="spellEnd"/>
-      <w:r>
-        <w:rPr>
-          <w:iCs/>
-        </w:rPr>
-        <w:t xml:space="preserve"> </w:t>
-      </w:r>
-      <w:proofErr w:type="spellStart"/>
-      <w:r>
-        <w:rPr>
-          <w:iCs/>
-        </w:rPr>
-        <w:t>dicatat</w:t>
-      </w:r>
-      <w:proofErr w:type="spellEnd"/>
-      <w:r>
-        <w:rPr>
-          <w:iCs/>
-        </w:rPr>
-        <w:t xml:space="preserve"> smartwatch </w:t>
-      </w:r>
-      <w:proofErr w:type="spellStart"/>
-      <w:r>
-        <w:rPr>
-          <w:iCs/>
-        </w:rPr>
-        <w:t>sebagai</w:t>
-      </w:r>
-      <w:proofErr w:type="spellEnd"/>
-      <w:r>
-        <w:rPr>
-          <w:iCs/>
-        </w:rPr>
-        <w:t xml:space="preserve"> </w:t>
-      </w:r>
-      <w:proofErr w:type="spellStart"/>
-      <w:r>
-        <w:rPr>
-          <w:iCs/>
-        </w:rPr>
-        <w:t>pelanggan</w:t>
-      </w:r>
-      <w:proofErr w:type="spellEnd"/>
-      <w:r>
-        <w:rPr>
-          <w:iCs/>
-        </w:rPr>
-        <w:t xml:space="preserve"> (subscriber). Pada </w:t>
-      </w:r>
-      <w:proofErr w:type="spellStart"/>
-      <w:r>
-        <w:rPr>
-          <w:iCs/>
-        </w:rPr>
-        <w:t>fase</w:t>
-      </w:r>
-      <w:proofErr w:type="spellEnd"/>
-      <w:r>
-        <w:rPr>
-          <w:iCs/>
-        </w:rPr>
-        <w:t xml:space="preserve"> Notify, smartwatch </w:t>
-      </w:r>
-      <w:proofErr w:type="spellStart"/>
-      <w:r>
-        <w:rPr>
-          <w:iCs/>
-        </w:rPr>
-        <w:t>mengirim</w:t>
-      </w:r>
-      <w:proofErr w:type="spellEnd"/>
-      <w:r>
-        <w:rPr>
-          <w:iCs/>
-        </w:rPr>
-        <w:t xml:space="preserve"> batch data </w:t>
-      </w:r>
-      <w:proofErr w:type="spellStart"/>
-      <w:r>
-        <w:rPr>
-          <w:iCs/>
-        </w:rPr>
-        <w:t>secara</w:t>
-      </w:r>
-      <w:proofErr w:type="spellEnd"/>
-      <w:r>
-        <w:rPr>
-          <w:iCs/>
-        </w:rPr>
-        <w:t xml:space="preserve"> </w:t>
-      </w:r>
-      <w:proofErr w:type="spellStart"/>
-      <w:r>
-        <w:rPr>
-          <w:iCs/>
-        </w:rPr>
-        <w:t>berbingkai</w:t>
-      </w:r>
-      <w:proofErr w:type="spellEnd"/>
-      <w:r>
-        <w:rPr>
-          <w:iCs/>
-        </w:rPr>
-        <w:t xml:space="preserve">; </w:t>
-      </w:r>
-      <w:proofErr w:type="spellStart"/>
-      <w:r>
-        <w:rPr>
-          <w:iCs/>
-        </w:rPr>
-        <w:t>bingkai</w:t>
-      </w:r>
-      <w:proofErr w:type="spellEnd"/>
-      <w:r>
-        <w:rPr>
-          <w:iCs/>
-        </w:rPr>
-        <w:t xml:space="preserve"> </w:t>
-      </w:r>
-      <w:proofErr w:type="spellStart"/>
-      <w:r>
-        <w:rPr>
-          <w:iCs/>
-        </w:rPr>
-        <w:t>bertanda</w:t>
-      </w:r>
-      <w:proofErr w:type="spellEnd"/>
-      <w:r>
-        <w:rPr>
-          <w:iCs/>
-        </w:rPr>
-        <w:t xml:space="preserve"> “loop [per frame]” </w:t>
-      </w:r>
-      <w:proofErr w:type="spellStart"/>
-      <w:r>
-        <w:rPr>
-          <w:iCs/>
-        </w:rPr>
-        <w:t>menegaskan</w:t>
-      </w:r>
-      <w:proofErr w:type="spellEnd"/>
-      <w:r>
-        <w:rPr>
-          <w:iCs/>
-        </w:rPr>
-        <w:t xml:space="preserve"> </w:t>
-      </w:r>
-      <w:proofErr w:type="spellStart"/>
-      <w:r>
-        <w:rPr>
-          <w:iCs/>
-        </w:rPr>
-        <w:t>bahwa</w:t>
-      </w:r>
-      <w:proofErr w:type="spellEnd"/>
-      <w:r>
-        <w:rPr>
-          <w:iCs/>
-        </w:rPr>
-        <w:t xml:space="preserve"> </w:t>
-      </w:r>
-      <w:proofErr w:type="spellStart"/>
-      <w:r>
-        <w:rPr>
-          <w:iCs/>
-        </w:rPr>
-        <w:t>setiap</w:t>
-      </w:r>
-      <w:proofErr w:type="spellEnd"/>
-      <w:r>
-        <w:rPr>
-          <w:iCs/>
-        </w:rPr>
-        <w:t xml:space="preserve"> frame </w:t>
-      </w:r>
-      <w:proofErr w:type="spellStart"/>
-      <w:r>
-        <w:rPr>
-          <w:iCs/>
-        </w:rPr>
-        <w:t>dikirim</w:t>
-      </w:r>
-      <w:proofErr w:type="spellEnd"/>
-      <w:r>
-        <w:rPr>
-          <w:iCs/>
-        </w:rPr>
-        <w:t xml:space="preserve"> </w:t>
-      </w:r>
-      <w:proofErr w:type="spellStart"/>
-      <w:r>
-        <w:rPr>
-          <w:iCs/>
-        </w:rPr>
-        <w:t>satu</w:t>
-      </w:r>
-      <w:proofErr w:type="spellEnd"/>
-      <w:r>
-        <w:rPr>
-          <w:iCs/>
-        </w:rPr>
-        <w:t xml:space="preserve"> per </w:t>
-      </w:r>
-      <w:proofErr w:type="spellStart"/>
-      <w:r>
-        <w:rPr>
-          <w:iCs/>
-        </w:rPr>
-        <w:t>satu</w:t>
-      </w:r>
-      <w:proofErr w:type="spellEnd"/>
-      <w:r>
-        <w:rPr>
-          <w:iCs/>
-        </w:rPr>
-        <w:t xml:space="preserve"> </w:t>
-      </w:r>
-      <w:proofErr w:type="spellStart"/>
-      <w:r>
-        <w:rPr>
-          <w:iCs/>
-        </w:rPr>
-        <w:t>dengan</w:t>
-      </w:r>
-      <w:proofErr w:type="spellEnd"/>
-      <w:r>
-        <w:rPr>
-          <w:iCs/>
-        </w:rPr>
-        <w:t xml:space="preserve"> flow control frame </w:t>
-      </w:r>
-      <w:proofErr w:type="spellStart"/>
-      <w:r>
-        <w:rPr>
-          <w:iCs/>
-        </w:rPr>
-        <w:t>berikutnya</w:t>
-      </w:r>
-      <w:proofErr w:type="spellEnd"/>
-      <w:r>
-        <w:rPr>
-          <w:iCs/>
-        </w:rPr>
-        <w:t xml:space="preserve"> </w:t>
-      </w:r>
-      <w:proofErr w:type="spellStart"/>
-      <w:r>
-        <w:rPr>
-          <w:iCs/>
-        </w:rPr>
-        <w:t>baru</w:t>
-      </w:r>
-      <w:proofErr w:type="spellEnd"/>
-      <w:r>
-        <w:rPr>
-          <w:iCs/>
-        </w:rPr>
-        <w:t xml:space="preserve"> </w:t>
-      </w:r>
-      <w:proofErr w:type="spellStart"/>
-      <w:r>
-        <w:rPr>
-          <w:iCs/>
-        </w:rPr>
-        <w:t>dikirim</w:t>
-      </w:r>
-      <w:proofErr w:type="spellEnd"/>
-      <w:r>
-        <w:rPr>
-          <w:iCs/>
-        </w:rPr>
-        <w:t xml:space="preserve"> </w:t>
-      </w:r>
-      <w:proofErr w:type="spellStart"/>
-      <w:r>
-        <w:rPr>
-          <w:iCs/>
-        </w:rPr>
-        <w:t>setelah</w:t>
-      </w:r>
-      <w:proofErr w:type="spellEnd"/>
-      <w:r>
-        <w:rPr>
-          <w:iCs/>
-        </w:rPr>
-        <w:t xml:space="preserve"> </w:t>
-      </w:r>
-      <w:proofErr w:type="spellStart"/>
-      <w:r>
-        <w:rPr>
-          <w:iCs/>
-        </w:rPr>
-        <w:t>pengiriman</w:t>
-      </w:r>
-      <w:proofErr w:type="spellEnd"/>
-      <w:r>
-        <w:rPr>
-          <w:iCs/>
-        </w:rPr>
-        <w:t xml:space="preserve"> frame </w:t>
-      </w:r>
-      <w:proofErr w:type="spellStart"/>
-      <w:r>
-        <w:rPr>
-          <w:iCs/>
-        </w:rPr>
-        <w:t>sebelumnya</w:t>
-      </w:r>
-      <w:proofErr w:type="spellEnd"/>
-      <w:r>
-        <w:rPr>
-          <w:iCs/>
-        </w:rPr>
-        <w:t xml:space="preserve"> </w:t>
-      </w:r>
-      <w:proofErr w:type="spellStart"/>
-      <w:r>
-        <w:rPr>
-          <w:iCs/>
-        </w:rPr>
-        <w:t>dikonfirmasi</w:t>
-      </w:r>
-      <w:proofErr w:type="spellEnd"/>
-      <w:r>
-        <w:rPr>
-          <w:iCs/>
-        </w:rPr>
-        <w:t xml:space="preserve"> </w:t>
-      </w:r>
-      <w:proofErr w:type="spellStart"/>
-      <w:r>
-        <w:rPr>
-          <w:iCs/>
-        </w:rPr>
-        <w:t>tuntas</w:t>
-      </w:r>
-      <w:proofErr w:type="spellEnd"/>
-      <w:r>
-        <w:rPr>
-          <w:iCs/>
-        </w:rPr>
-        <w:t xml:space="preserve"> (</w:t>
-      </w:r>
-      <w:proofErr w:type="spellStart"/>
-      <w:r>
-        <w:rPr>
-          <w:iCs/>
-        </w:rPr>
-        <w:t>onNotificationSent</w:t>
-      </w:r>
-      <w:proofErr w:type="spellEnd"/>
-      <w:r>
-        <w:rPr>
-          <w:iCs/>
-        </w:rPr>
-        <w:t xml:space="preserve">) </w:t>
-      </w:r>
-      <w:proofErr w:type="spellStart"/>
-      <w:r>
-        <w:rPr>
-          <w:iCs/>
-        </w:rPr>
-        <w:t>hingga</w:t>
-      </w:r>
-      <w:proofErr w:type="spellEnd"/>
-      <w:r>
-        <w:rPr>
-          <w:iCs/>
-        </w:rPr>
-        <w:t xml:space="preserve"> frame END </w:t>
-      </w:r>
-      <w:proofErr w:type="spellStart"/>
-      <w:r>
-        <w:rPr>
-          <w:iCs/>
-        </w:rPr>
-        <w:t>memicu</w:t>
-      </w:r>
-      <w:proofErr w:type="spellEnd"/>
-      <w:r>
-        <w:rPr>
-          <w:iCs/>
-        </w:rPr>
-        <w:t xml:space="preserve"> smartphone </w:t>
-      </w:r>
-      <w:proofErr w:type="spellStart"/>
-      <w:r>
-        <w:rPr>
-          <w:iCs/>
-        </w:rPr>
-        <w:t>mendekode</w:t>
-      </w:r>
-      <w:proofErr w:type="spellEnd"/>
-      <w:r>
-        <w:rPr>
-          <w:iCs/>
-        </w:rPr>
-        <w:t xml:space="preserve"> JSON dan </w:t>
-      </w:r>
-      <w:proofErr w:type="spellStart"/>
-      <w:r>
-        <w:rPr>
-          <w:iCs/>
-        </w:rPr>
-        <w:t>menyimpannya</w:t>
-      </w:r>
-      <w:proofErr w:type="spellEnd"/>
-      <w:r>
-        <w:rPr>
-          <w:iCs/>
-        </w:rPr>
-        <w:t xml:space="preserve">. </w:t>
-      </w:r>
-      <w:proofErr w:type="spellStart"/>
-      <w:r>
-        <w:rPr>
-          <w:iCs/>
-        </w:rPr>
-        <w:t>Terakhir</w:t>
-      </w:r>
-      <w:proofErr w:type="spellEnd"/>
-      <w:r>
-        <w:rPr>
-          <w:iCs/>
-        </w:rPr>
-        <w:t xml:space="preserve">, pada </w:t>
-      </w:r>
-      <w:proofErr w:type="spellStart"/>
-      <w:r>
-        <w:rPr>
-          <w:iCs/>
-        </w:rPr>
-        <w:t>fase</w:t>
-      </w:r>
-      <w:proofErr w:type="spellEnd"/>
-      <w:r>
-        <w:rPr>
-          <w:iCs/>
-        </w:rPr>
-        <w:t xml:space="preserve"> ACK, smartphone </w:t>
-      </w:r>
-      <w:proofErr w:type="spellStart"/>
-      <w:r>
-        <w:rPr>
-          <w:iCs/>
-        </w:rPr>
-        <w:t>menuliskan</w:t>
-      </w:r>
-      <w:proofErr w:type="spellEnd"/>
-      <w:r>
-        <w:rPr>
-          <w:iCs/>
-        </w:rPr>
-        <w:t xml:space="preserve"> </w:t>
-      </w:r>
-      <w:proofErr w:type="spellStart"/>
-      <w:r>
-        <w:rPr>
-          <w:iCs/>
-        </w:rPr>
-        <w:t>jumlah</w:t>
-      </w:r>
-      <w:proofErr w:type="spellEnd"/>
-      <w:r>
-        <w:rPr>
-          <w:iCs/>
-        </w:rPr>
-        <w:t xml:space="preserve"> record yang </w:t>
-      </w:r>
-      <w:proofErr w:type="spellStart"/>
-      <w:r>
-        <w:rPr>
-          <w:iCs/>
-        </w:rPr>
-        <w:t>berhasil</w:t>
-      </w:r>
-      <w:proofErr w:type="spellEnd"/>
-      <w:r>
-        <w:rPr>
-          <w:iCs/>
-        </w:rPr>
-        <w:t xml:space="preserve"> </w:t>
-      </w:r>
-      <w:proofErr w:type="spellStart"/>
-      <w:r>
-        <w:rPr>
-          <w:iCs/>
-        </w:rPr>
-        <w:t>disimpan</w:t>
-      </w:r>
-      <w:proofErr w:type="spellEnd"/>
-      <w:r>
-        <w:rPr>
-          <w:iCs/>
-        </w:rPr>
-        <w:t xml:space="preserve"> </w:t>
-      </w:r>
-      <w:proofErr w:type="spellStart"/>
-      <w:r>
-        <w:rPr>
-          <w:iCs/>
-        </w:rPr>
-        <w:t>ke</w:t>
-      </w:r>
-      <w:proofErr w:type="spellEnd"/>
-      <w:r>
-        <w:rPr>
-          <w:iCs/>
-        </w:rPr>
-        <w:t xml:space="preserve"> </w:t>
-      </w:r>
-      <w:proofErr w:type="spellStart"/>
-      <w:r>
-        <w:rPr>
-          <w:iCs/>
-        </w:rPr>
-        <w:t>karakteristik</w:t>
-      </w:r>
-      <w:proofErr w:type="spellEnd"/>
-      <w:r>
-        <w:rPr>
-          <w:iCs/>
-        </w:rPr>
-        <w:t xml:space="preserve"> </w:t>
-      </w:r>
-      <w:proofErr w:type="spellStart"/>
-      <w:r>
-        <w:rPr>
-          <w:iCs/>
-        </w:rPr>
-        <w:t>konfirmasi</w:t>
-      </w:r>
-      <w:proofErr w:type="spellEnd"/>
-      <w:r>
-        <w:rPr>
-          <w:iCs/>
-        </w:rPr>
-        <w:t xml:space="preserve"> </w:t>
-      </w:r>
-      <w:proofErr w:type="spellStart"/>
-      <w:r>
-        <w:rPr>
-          <w:iCs/>
-        </w:rPr>
-        <w:t>sehingga</w:t>
-      </w:r>
-      <w:proofErr w:type="spellEnd"/>
-      <w:r>
-        <w:rPr>
-          <w:iCs/>
-        </w:rPr>
-        <w:t xml:space="preserve"> smartwatch </w:t>
-      </w:r>
-      <w:proofErr w:type="spellStart"/>
-      <w:r>
-        <w:rPr>
-          <w:iCs/>
-        </w:rPr>
-        <w:t>menandai</w:t>
-      </w:r>
-      <w:proofErr w:type="spellEnd"/>
-      <w:r>
-        <w:rPr>
-          <w:iCs/>
-        </w:rPr>
-        <w:t xml:space="preserve"> data </w:t>
-      </w:r>
-      <w:proofErr w:type="spellStart"/>
-      <w:r>
-        <w:rPr>
-          <w:iCs/>
-        </w:rPr>
-        <w:t>tersebut</w:t>
-      </w:r>
-      <w:proofErr w:type="spellEnd"/>
-      <w:r>
-        <w:rPr>
-          <w:iCs/>
-        </w:rPr>
-        <w:t xml:space="preserve"> </w:t>
-      </w:r>
-      <w:proofErr w:type="spellStart"/>
-      <w:r>
-        <w:rPr>
-          <w:iCs/>
-        </w:rPr>
-        <w:t>sebagai</w:t>
-      </w:r>
-      <w:proofErr w:type="spellEnd"/>
-      <w:r>
-        <w:rPr>
-          <w:iCs/>
-        </w:rPr>
-        <w:t xml:space="preserve"> </w:t>
-      </w:r>
-      <w:proofErr w:type="spellStart"/>
-      <w:r>
-        <w:rPr>
-          <w:iCs/>
-        </w:rPr>
-        <w:t>sudah</w:t>
-      </w:r>
-      <w:proofErr w:type="spellEnd"/>
-      <w:r>
-        <w:rPr>
-          <w:iCs/>
-        </w:rPr>
-        <w:t xml:space="preserve"> </w:t>
-      </w:r>
-      <w:proofErr w:type="spellStart"/>
-      <w:r>
-        <w:rPr>
-          <w:iCs/>
-        </w:rPr>
-        <w:t>terkirim</w:t>
-      </w:r>
-      <w:proofErr w:type="spellEnd"/>
-      <w:r>
-        <w:rPr>
-          <w:iCs/>
-        </w:rPr>
-        <w:t xml:space="preserve"> (</w:t>
-      </w:r>
-      <w:proofErr w:type="spellStart"/>
-      <w:r>
-        <w:rPr>
-          <w:iCs/>
-        </w:rPr>
-        <w:t>markSynced</w:t>
-      </w:r>
-      <w:proofErr w:type="spellEnd"/>
-      <w:r>
-        <w:rPr>
-          <w:iCs/>
-        </w:rPr>
-        <w:t xml:space="preserve"> = 1). Garis </w:t>
-      </w:r>
-      <w:proofErr w:type="spellStart"/>
-      <w:r>
-        <w:rPr>
-          <w:iCs/>
-        </w:rPr>
-        <w:t>penuh</w:t>
-      </w:r>
-      <w:proofErr w:type="spellEnd"/>
-      <w:r>
-        <w:rPr>
-          <w:iCs/>
-        </w:rPr>
-        <w:t xml:space="preserve"> </w:t>
-      </w:r>
-      <w:proofErr w:type="spellStart"/>
-      <w:r>
-        <w:rPr>
-          <w:iCs/>
-        </w:rPr>
-        <w:t>menandakan</w:t>
-      </w:r>
-      <w:proofErr w:type="spellEnd"/>
-      <w:r>
-        <w:rPr>
-          <w:iCs/>
-        </w:rPr>
-        <w:t xml:space="preserve"> </w:t>
-      </w:r>
-      <w:proofErr w:type="spellStart"/>
-      <w:r>
-        <w:rPr>
-          <w:iCs/>
-        </w:rPr>
-        <w:t>aliran</w:t>
-      </w:r>
-      <w:proofErr w:type="spellEnd"/>
-      <w:r>
-        <w:rPr>
-          <w:iCs/>
-        </w:rPr>
-        <w:t xml:space="preserve"> </w:t>
-      </w:r>
-      <w:proofErr w:type="spellStart"/>
-      <w:r>
-        <w:rPr>
-          <w:iCs/>
-        </w:rPr>
-        <w:t>notifikasi</w:t>
-      </w:r>
-      <w:proofErr w:type="spellEnd"/>
-      <w:r>
-        <w:rPr>
-          <w:iCs/>
-        </w:rPr>
-        <w:t xml:space="preserve">/data </w:t>
-      </w:r>
-      <w:proofErr w:type="spellStart"/>
-      <w:r>
-        <w:rPr>
-          <w:iCs/>
-        </w:rPr>
-        <w:t>dari</w:t>
-      </w:r>
-      <w:proofErr w:type="spellEnd"/>
-      <w:r>
-        <w:rPr>
-          <w:iCs/>
-        </w:rPr>
-        <w:t xml:space="preserve"> server </w:t>
-      </w:r>
-      <w:proofErr w:type="spellStart"/>
-      <w:r>
-        <w:rPr>
-          <w:iCs/>
-        </w:rPr>
-        <w:t>ke</w:t>
-      </w:r>
-      <w:proofErr w:type="spellEnd"/>
-      <w:r>
-        <w:rPr>
-          <w:iCs/>
-        </w:rPr>
-        <w:t xml:space="preserve"> client, </w:t>
-      </w:r>
-      <w:proofErr w:type="spellStart"/>
-      <w:r>
-        <w:rPr>
-          <w:iCs/>
-        </w:rPr>
-        <w:t>sedangkan</w:t>
-      </w:r>
-      <w:proofErr w:type="spellEnd"/>
-      <w:r>
-        <w:rPr>
-          <w:iCs/>
-        </w:rPr>
-        <w:t xml:space="preserve"> garis </w:t>
-      </w:r>
-      <w:proofErr w:type="spellStart"/>
-      <w:r>
-        <w:rPr>
-          <w:iCs/>
-        </w:rPr>
-        <w:t>putus-putus</w:t>
-      </w:r>
-      <w:proofErr w:type="spellEnd"/>
-      <w:r>
-        <w:rPr>
-          <w:iCs/>
-        </w:rPr>
-        <w:t xml:space="preserve"> </w:t>
-      </w:r>
-      <w:proofErr w:type="spellStart"/>
-      <w:r>
-        <w:rPr>
-          <w:iCs/>
-        </w:rPr>
-        <w:t>menandakan</w:t>
-      </w:r>
-      <w:proofErr w:type="spellEnd"/>
-      <w:r>
-        <w:rPr>
-          <w:iCs/>
-        </w:rPr>
-        <w:t xml:space="preserve"> </w:t>
-      </w:r>
-      <w:proofErr w:type="spellStart"/>
-      <w:r>
-        <w:rPr>
-          <w:iCs/>
-        </w:rPr>
-        <w:t>penulisan</w:t>
-      </w:r>
-      <w:proofErr w:type="spellEnd"/>
-      <w:r>
-        <w:rPr>
-          <w:iCs/>
-        </w:rPr>
-        <w:t xml:space="preserve"> </w:t>
-      </w:r>
-      <w:proofErr w:type="spellStart"/>
-      <w:r>
-        <w:rPr>
-          <w:iCs/>
-        </w:rPr>
-        <w:t>konfirmasi</w:t>
-      </w:r>
-      <w:proofErr w:type="spellEnd"/>
-      <w:r>
-        <w:rPr>
-          <w:iCs/>
-        </w:rPr>
-        <w:t xml:space="preserve"> (ACK) dan </w:t>
-      </w:r>
-      <w:proofErr w:type="spellStart"/>
-      <w:r>
-        <w:rPr>
-          <w:iCs/>
-        </w:rPr>
-        <w:t>balasannya</w:t>
-      </w:r>
-      <w:proofErr w:type="spellEnd"/>
-      <w:r>
-        <w:rPr>
-          <w:iCs/>
-        </w:rPr>
-        <w:t xml:space="preserve"> (response).</w:t>
+        <w:t>Pada fase Setup, smartwatch membuka GATT server, mendaftarkan layanan beserta karakteristiknya, lalu memancarkan iklan (advertising) berisi UUID layanan. Pada fase Connect &amp; discover, smartphone memindai, membangun koneksi, menegosiasikan MTU (hingga 512 byte), dan menelusuri layanan untuk menemukan karakteristik yang dibutuhkan. Pada fase Subscribe, smartphone mengaktifkan notifikasi dengan menulis nilai 0x01 0x00 ke deskriptor CCCD, yang kemudian dicatat smartwatch sebagai pelanggan (subscriber). Pada fase Notify, smartwatch mengirim batch data secara berbingkai; bingkai bertanda “loop [per frame]” menegaskan bahwa setiap frame dikirim satu per satu dengan flow control frame berikutnya baru dikirim setelah pengiriman frame sebelumnya dikonfirmasi tuntas (onNotificationSent) hingga frame END memicu smartphone mendekode JSON dan menyimpannya. Terakhir, pada fase ACK, smartphone menuliskan jumlah record yang berhasil disimpan ke karakteristik konfirmasi sehingga smartwatch menandai data tersebut sebagai sudah terkirim (markSynced = 1). Garis penuh menandakan aliran notifikasi/data dari server ke client, sedangkan garis putus-putus menandakan penulisan konfirmasi (ACK) dan balasannya (response).</w:t>
       </w:r>
     </w:p>
     <w:p>
@@ -2500,7 +590,7 @@
           <w:i/>
           <w:sz w:val="18"/>
         </w:rPr>
-        <w:t>Gambar 2. Struktur pemecahan paket menjadi frame START / DATA / END (satu frame = satu notifikasi BLE).</w:t>
+        <w:t>Gambar 3. Struktur pemecahan paket menjadi frame START / DATA / END (satu frame = satu notifikasi BLE).</w:t>
       </w:r>
     </w:p>
     <w:p>
@@ -2508,665 +598,10 @@
         <w:jc w:val="both"/>
       </w:pPr>
       <w:r>
-        <w:t xml:space="preserve">Gambar 2 </w:t>
+        <w:t>Gambar 3 menjelaskan mekanisme pembingkaian (framing) yang dipakai untuk mengirim satu batch data yang berukuran lebih besar daripada kapasitas satu notifikasi BLE. Satu batch berupa array JSON [{bpm, accuracy, time}, ...] dipecah (split) menjadi rangkaian frame: diawali frame START (opcode 0x01), diikuti sejumlah frame DATA (opcode 0x02) yang masing-masing membawa satu potongan (chunk) byte JSON secara berurutan, lalu ditutup frame END (opcode 0x03) sebagai penanda batch selesai. Inset di bagian bawah merinci struktur satu frame DATA: satu byte pertama adalah opcode (0x02) yang menandai jenis frame, diikuti muatan potongan JSON sepanjang maksimum MTU−4 byte (yaitu MTU dikurangi 3 byte header ATT dan 1 byte opcode). Setiap frame dikirim sebagai satu notifikasi BLE dan bersifat flow-controlled: frame berikutnya baru dikirim setelah frame sebelumnya tuntas terkirim, sehingga tidak terjadi penumpukan maupun kehilangan data. Di sisi penerima, smartphone merangkai kembali potongan-potongan tersebut hingga frame END diterima, lalu mendekodekannya menjadi satu array JSON yang utuh.</w:t>
       </w:r>
-      <w:proofErr w:type="spellStart"/>
-      <w:r>
-        <w:t>menjelaskan</w:t>
-      </w:r>
-      <w:proofErr w:type="spellEnd"/>
-      <w:r>
-        <w:t xml:space="preserve"> </w:t>
-      </w:r>
-      <w:proofErr w:type="spellStart"/>
-      <w:r>
-        <w:t>mekanisme</w:t>
-      </w:r>
-      <w:proofErr w:type="spellEnd"/>
-      <w:r>
-        <w:t xml:space="preserve"> </w:t>
-      </w:r>
-      <w:proofErr w:type="spellStart"/>
-      <w:r>
-        <w:t>pembingkaian</w:t>
-      </w:r>
-      <w:proofErr w:type="spellEnd"/>
-      <w:r>
-        <w:t xml:space="preserve"> (framing) yang </w:t>
-      </w:r>
-      <w:proofErr w:type="spellStart"/>
-      <w:r>
-        <w:t>dipakai</w:t>
-      </w:r>
-      <w:proofErr w:type="spellEnd"/>
-      <w:r>
-        <w:t xml:space="preserve"> </w:t>
-      </w:r>
-      <w:proofErr w:type="spellStart"/>
-      <w:r>
-        <w:t>untuk</w:t>
-      </w:r>
-      <w:proofErr w:type="spellEnd"/>
-      <w:r>
-        <w:t xml:space="preserve"> </w:t>
-      </w:r>
-      <w:proofErr w:type="spellStart"/>
-      <w:r>
-        <w:t>mengirim</w:t>
-      </w:r>
-      <w:proofErr w:type="spellEnd"/>
-      <w:r>
-        <w:t xml:space="preserve"> </w:t>
-      </w:r>
-      <w:proofErr w:type="spellStart"/>
-      <w:r>
-        <w:t>satu</w:t>
-      </w:r>
-      <w:proofErr w:type="spellEnd"/>
-      <w:r>
-        <w:t xml:space="preserve"> batch data yang </w:t>
-      </w:r>
-      <w:proofErr w:type="spellStart"/>
-      <w:r>
-        <w:t>berukuran</w:t>
-      </w:r>
-      <w:proofErr w:type="spellEnd"/>
-      <w:r>
-        <w:t xml:space="preserve"> </w:t>
-      </w:r>
-      <w:proofErr w:type="spellStart"/>
-      <w:r>
-        <w:t>lebih</w:t>
-      </w:r>
-      <w:proofErr w:type="spellEnd"/>
-      <w:r>
-        <w:t xml:space="preserve"> </w:t>
-      </w:r>
-      <w:proofErr w:type="spellStart"/>
-      <w:r>
-        <w:t>besar</w:t>
-      </w:r>
-      <w:proofErr w:type="spellEnd"/>
-      <w:r>
-        <w:t xml:space="preserve"> </w:t>
-      </w:r>
-      <w:proofErr w:type="spellStart"/>
-      <w:r>
-        <w:t>daripada</w:t>
-      </w:r>
-      <w:proofErr w:type="spellEnd"/>
-      <w:r>
-        <w:t xml:space="preserve"> </w:t>
-      </w:r>
-      <w:proofErr w:type="spellStart"/>
-      <w:r>
-        <w:t>kapasitas</w:t>
-      </w:r>
-      <w:proofErr w:type="spellEnd"/>
-      <w:r>
-        <w:t xml:space="preserve"> </w:t>
-      </w:r>
-      <w:proofErr w:type="spellStart"/>
-      <w:r>
-        <w:t>satu</w:t>
-      </w:r>
-      <w:proofErr w:type="spellEnd"/>
-      <w:r>
-        <w:t xml:space="preserve"> </w:t>
-      </w:r>
-      <w:proofErr w:type="spellStart"/>
-      <w:r>
-        <w:t>notifikasi</w:t>
-      </w:r>
-      <w:proofErr w:type="spellEnd"/>
-      <w:r>
-        <w:t xml:space="preserve"> BLE. Satu batch </w:t>
-      </w:r>
-      <w:proofErr w:type="spellStart"/>
-      <w:r>
-        <w:t>berupa</w:t>
-      </w:r>
-      <w:proofErr w:type="spellEnd"/>
-      <w:r>
-        <w:t xml:space="preserve"> array JSON [{bpm, accuracy, time}, ...] </w:t>
-      </w:r>
-      <w:proofErr w:type="spellStart"/>
-      <w:r>
-        <w:t>dipecah</w:t>
-      </w:r>
-      <w:proofErr w:type="spellEnd"/>
-      <w:r>
-        <w:t xml:space="preserve"> (split) </w:t>
-      </w:r>
-      <w:proofErr w:type="spellStart"/>
-      <w:r>
-        <w:t>menjadi</w:t>
-      </w:r>
-      <w:proofErr w:type="spellEnd"/>
-      <w:r>
-        <w:t xml:space="preserve"> </w:t>
-      </w:r>
-      <w:proofErr w:type="spellStart"/>
-      <w:r>
-        <w:t>rangkaian</w:t>
-      </w:r>
-      <w:proofErr w:type="spellEnd"/>
-      <w:r>
-        <w:t xml:space="preserve"> frame: </w:t>
-      </w:r>
-      <w:proofErr w:type="spellStart"/>
-      <w:r>
-        <w:t>diawali</w:t>
-      </w:r>
-      <w:proofErr w:type="spellEnd"/>
-      <w:r>
-        <w:t xml:space="preserve"> frame START (opcode 0x01), </w:t>
-      </w:r>
-      <w:proofErr w:type="spellStart"/>
-      <w:r>
-        <w:t>diikuti</w:t>
-      </w:r>
-      <w:proofErr w:type="spellEnd"/>
-      <w:r>
-        <w:t xml:space="preserve"> </w:t>
-      </w:r>
-      <w:proofErr w:type="spellStart"/>
-      <w:r>
-        <w:t>sejumlah</w:t>
-      </w:r>
-      <w:proofErr w:type="spellEnd"/>
-      <w:r>
-        <w:t xml:space="preserve"> frame DATA (opcode 0x02) yang masing-masing </w:t>
-      </w:r>
-      <w:proofErr w:type="spellStart"/>
-      <w:r>
-        <w:t>membawa</w:t>
-      </w:r>
-      <w:proofErr w:type="spellEnd"/>
-      <w:r>
-        <w:t xml:space="preserve"> </w:t>
-      </w:r>
-      <w:proofErr w:type="spellStart"/>
-      <w:r>
-        <w:t>satu</w:t>
-      </w:r>
-      <w:proofErr w:type="spellEnd"/>
-      <w:r>
-        <w:t xml:space="preserve"> </w:t>
-      </w:r>
-      <w:proofErr w:type="spellStart"/>
-      <w:r>
-        <w:t>potongan</w:t>
-      </w:r>
-      <w:proofErr w:type="spellEnd"/>
-      <w:r>
-        <w:t xml:space="preserve"> (chunk) byte JSON </w:t>
-      </w:r>
-      <w:proofErr w:type="spellStart"/>
-      <w:r>
-        <w:t>secara</w:t>
-      </w:r>
-      <w:proofErr w:type="spellEnd"/>
-      <w:r>
-        <w:t xml:space="preserve"> </w:t>
-      </w:r>
-      <w:proofErr w:type="spellStart"/>
-      <w:r>
-        <w:t>berurutan</w:t>
-      </w:r>
-      <w:proofErr w:type="spellEnd"/>
-      <w:r>
-        <w:t xml:space="preserve">, </w:t>
-      </w:r>
-      <w:proofErr w:type="spellStart"/>
-      <w:r>
-        <w:t>lalu</w:t>
-      </w:r>
-      <w:proofErr w:type="spellEnd"/>
-      <w:r>
-        <w:t xml:space="preserve"> </w:t>
-      </w:r>
-      <w:proofErr w:type="spellStart"/>
-      <w:r>
-        <w:t>ditutup</w:t>
-      </w:r>
-      <w:proofErr w:type="spellEnd"/>
-      <w:r>
-        <w:t xml:space="preserve"> frame END (opcode 0x03) </w:t>
-      </w:r>
-      <w:proofErr w:type="spellStart"/>
-      <w:r>
-        <w:t>sebagai</w:t>
-      </w:r>
-      <w:proofErr w:type="spellEnd"/>
-      <w:r>
-        <w:t xml:space="preserve"> </w:t>
-      </w:r>
-      <w:proofErr w:type="spellStart"/>
-      <w:r>
-        <w:t>penanda</w:t>
-      </w:r>
-      <w:proofErr w:type="spellEnd"/>
-      <w:r>
-        <w:t xml:space="preserve"> batch </w:t>
-      </w:r>
-      <w:proofErr w:type="spellStart"/>
-      <w:r>
-        <w:t>selesai</w:t>
-      </w:r>
-      <w:proofErr w:type="spellEnd"/>
-      <w:r>
-        <w:t>.</w:t>
-      </w:r>
-      <w:r>
-        <w:t xml:space="preserve"> </w:t>
-      </w:r>
-      <w:r>
-        <w:t xml:space="preserve">Inset di </w:t>
-      </w:r>
-      <w:proofErr w:type="spellStart"/>
-      <w:r>
-        <w:t>bagian</w:t>
-      </w:r>
-      <w:proofErr w:type="spellEnd"/>
-      <w:r>
-        <w:t xml:space="preserve"> </w:t>
-      </w:r>
-      <w:proofErr w:type="spellStart"/>
-      <w:r>
-        <w:t>bawah</w:t>
-      </w:r>
-      <w:proofErr w:type="spellEnd"/>
-      <w:r>
-        <w:t xml:space="preserve"> </w:t>
-      </w:r>
-      <w:proofErr w:type="spellStart"/>
-      <w:r>
-        <w:t>merinci</w:t>
-      </w:r>
-      <w:proofErr w:type="spellEnd"/>
-      <w:r>
-        <w:t xml:space="preserve"> </w:t>
-      </w:r>
-      <w:proofErr w:type="spellStart"/>
-      <w:r>
-        <w:t>struktur</w:t>
-      </w:r>
-      <w:proofErr w:type="spellEnd"/>
-      <w:r>
-        <w:t xml:space="preserve"> </w:t>
-      </w:r>
-      <w:proofErr w:type="spellStart"/>
-      <w:r>
-        <w:t>satu</w:t>
-      </w:r>
-      <w:proofErr w:type="spellEnd"/>
-      <w:r>
-        <w:t xml:space="preserve"> frame DATA: </w:t>
-      </w:r>
-      <w:proofErr w:type="spellStart"/>
-      <w:r>
-        <w:t>satu</w:t>
-      </w:r>
-      <w:proofErr w:type="spellEnd"/>
-      <w:r>
-        <w:t xml:space="preserve"> byte </w:t>
-      </w:r>
-      <w:proofErr w:type="spellStart"/>
-      <w:r>
-        <w:t>pertama</w:t>
-      </w:r>
-      <w:proofErr w:type="spellEnd"/>
-      <w:r>
-        <w:t xml:space="preserve"> </w:t>
-      </w:r>
-      <w:proofErr w:type="spellStart"/>
-      <w:r>
-        <w:t>adalah</w:t>
-      </w:r>
-      <w:proofErr w:type="spellEnd"/>
-      <w:r>
-        <w:t xml:space="preserve"> opcode (0x02) yang </w:t>
-      </w:r>
-      <w:proofErr w:type="spellStart"/>
-      <w:r>
-        <w:t>menandai</w:t>
-      </w:r>
-      <w:proofErr w:type="spellEnd"/>
-      <w:r>
-        <w:t xml:space="preserve"> </w:t>
-      </w:r>
-      <w:proofErr w:type="spellStart"/>
-      <w:r>
-        <w:t>jenis</w:t>
-      </w:r>
-      <w:proofErr w:type="spellEnd"/>
-      <w:r>
-        <w:t xml:space="preserve"> frame, </w:t>
-      </w:r>
-      <w:proofErr w:type="spellStart"/>
-      <w:r>
-        <w:t>diikuti</w:t>
-      </w:r>
-      <w:proofErr w:type="spellEnd"/>
-      <w:r>
-        <w:t xml:space="preserve"> </w:t>
-      </w:r>
-      <w:proofErr w:type="spellStart"/>
-      <w:r>
-        <w:t>muatan</w:t>
-      </w:r>
-      <w:proofErr w:type="spellEnd"/>
-      <w:r>
-        <w:t xml:space="preserve"> </w:t>
-      </w:r>
-      <w:proofErr w:type="spellStart"/>
-      <w:r>
-        <w:t>potongan</w:t>
-      </w:r>
-      <w:proofErr w:type="spellEnd"/>
-      <w:r>
-        <w:t xml:space="preserve"> JSON </w:t>
-      </w:r>
-      <w:proofErr w:type="spellStart"/>
-      <w:r>
-        <w:t>sepanjang</w:t>
-      </w:r>
-      <w:proofErr w:type="spellEnd"/>
-      <w:r>
-        <w:t xml:space="preserve"> </w:t>
-      </w:r>
-      <w:proofErr w:type="spellStart"/>
-      <w:r>
-        <w:t>maksimum</w:t>
-      </w:r>
-      <w:proofErr w:type="spellEnd"/>
-      <w:r>
-        <w:t xml:space="preserve"> MTU−4 byte (</w:t>
-      </w:r>
-      <w:proofErr w:type="spellStart"/>
-      <w:r>
-        <w:t>yaitu</w:t>
-      </w:r>
-      <w:proofErr w:type="spellEnd"/>
-      <w:r>
-        <w:t xml:space="preserve"> MTU </w:t>
-      </w:r>
-      <w:proofErr w:type="spellStart"/>
-      <w:r>
-        <w:t>dikurangi</w:t>
-      </w:r>
-      <w:proofErr w:type="spellEnd"/>
-      <w:r>
-        <w:t xml:space="preserve"> </w:t>
-      </w:r>
-      <w:proofErr w:type="gramStart"/>
-      <w:r>
-        <w:t>3</w:t>
-      </w:r>
-      <w:r>
-        <w:t xml:space="preserve"> </w:t>
-      </w:r>
-      <w:r>
-        <w:t>byte</w:t>
-      </w:r>
-      <w:proofErr w:type="gramEnd"/>
-      <w:r>
-        <w:t xml:space="preserve"> header ATT dan 1 byte opcode). </w:t>
-      </w:r>
-      <w:proofErr w:type="spellStart"/>
-      <w:r>
-        <w:t>Setiap</w:t>
-      </w:r>
-      <w:proofErr w:type="spellEnd"/>
-      <w:r>
-        <w:t xml:space="preserve"> frame </w:t>
-      </w:r>
-      <w:proofErr w:type="spellStart"/>
-      <w:r>
-        <w:t>dikirim</w:t>
-      </w:r>
-      <w:proofErr w:type="spellEnd"/>
-      <w:r>
-        <w:t xml:space="preserve"> </w:t>
-      </w:r>
-      <w:proofErr w:type="spellStart"/>
-      <w:r>
-        <w:t>sebagai</w:t>
-      </w:r>
-      <w:proofErr w:type="spellEnd"/>
-      <w:r>
-        <w:t xml:space="preserve"> </w:t>
-      </w:r>
-      <w:proofErr w:type="spellStart"/>
-      <w:r>
-        <w:t>satu</w:t>
-      </w:r>
-      <w:proofErr w:type="spellEnd"/>
-      <w:r>
-        <w:t xml:space="preserve"> </w:t>
-      </w:r>
-      <w:proofErr w:type="spellStart"/>
-      <w:r>
-        <w:t>notifikasi</w:t>
-      </w:r>
-      <w:proofErr w:type="spellEnd"/>
-      <w:r>
-        <w:t xml:space="preserve"> BLE dan </w:t>
-      </w:r>
-      <w:proofErr w:type="spellStart"/>
-      <w:r>
-        <w:t>bersifat</w:t>
-      </w:r>
-      <w:proofErr w:type="spellEnd"/>
-      <w:r>
-        <w:t xml:space="preserve"> flow-controlled: frame </w:t>
-      </w:r>
-      <w:proofErr w:type="spellStart"/>
-      <w:r>
-        <w:t>berikutnya</w:t>
-      </w:r>
-      <w:proofErr w:type="spellEnd"/>
-      <w:r>
-        <w:t xml:space="preserve"> </w:t>
-      </w:r>
-      <w:proofErr w:type="spellStart"/>
-      <w:r>
-        <w:t>baru</w:t>
-      </w:r>
-      <w:proofErr w:type="spellEnd"/>
-      <w:r>
-        <w:t xml:space="preserve"> </w:t>
-      </w:r>
-      <w:proofErr w:type="spellStart"/>
-      <w:r>
-        <w:t>dikirim</w:t>
-      </w:r>
-      <w:proofErr w:type="spellEnd"/>
-      <w:r>
-        <w:t xml:space="preserve"> </w:t>
-      </w:r>
-      <w:proofErr w:type="spellStart"/>
-      <w:r>
-        <w:t>setelah</w:t>
-      </w:r>
-      <w:proofErr w:type="spellEnd"/>
-      <w:r>
-        <w:t xml:space="preserve"> frame </w:t>
-      </w:r>
-      <w:proofErr w:type="spellStart"/>
-      <w:r>
-        <w:t>sebelumnya</w:t>
-      </w:r>
-      <w:proofErr w:type="spellEnd"/>
-      <w:r>
-        <w:t xml:space="preserve"> </w:t>
-      </w:r>
-      <w:proofErr w:type="spellStart"/>
-      <w:r>
-        <w:t>tuntas</w:t>
-      </w:r>
-      <w:proofErr w:type="spellEnd"/>
-      <w:r>
-        <w:t xml:space="preserve"> </w:t>
-      </w:r>
-      <w:proofErr w:type="spellStart"/>
-      <w:r>
-        <w:t>terkirim</w:t>
-      </w:r>
-      <w:proofErr w:type="spellEnd"/>
-      <w:r>
-        <w:t xml:space="preserve">, </w:t>
-      </w:r>
-      <w:proofErr w:type="spellStart"/>
-      <w:r>
-        <w:t>sehingga</w:t>
-      </w:r>
-      <w:proofErr w:type="spellEnd"/>
-      <w:r>
-        <w:t xml:space="preserve"> </w:t>
-      </w:r>
-      <w:proofErr w:type="spellStart"/>
-      <w:r>
-        <w:t>tidak</w:t>
-      </w:r>
-      <w:proofErr w:type="spellEnd"/>
-      <w:r>
-        <w:t xml:space="preserve"> </w:t>
-      </w:r>
-      <w:proofErr w:type="spellStart"/>
-      <w:r>
-        <w:t>terjadi</w:t>
-      </w:r>
-      <w:proofErr w:type="spellEnd"/>
-      <w:r>
-        <w:t xml:space="preserve"> </w:t>
-      </w:r>
-      <w:proofErr w:type="spellStart"/>
-      <w:r>
-        <w:t>penumpukan</w:t>
-      </w:r>
-      <w:proofErr w:type="spellEnd"/>
-      <w:r>
-        <w:t xml:space="preserve"> </w:t>
-      </w:r>
-      <w:proofErr w:type="spellStart"/>
-      <w:r>
-        <w:t>maupun</w:t>
-      </w:r>
-      <w:proofErr w:type="spellEnd"/>
-      <w:r>
-        <w:t xml:space="preserve"> </w:t>
-      </w:r>
-      <w:proofErr w:type="spellStart"/>
-      <w:r>
-        <w:t>kehilangan</w:t>
-      </w:r>
-      <w:proofErr w:type="spellEnd"/>
-      <w:r>
-        <w:t xml:space="preserve"> data. Di </w:t>
-      </w:r>
-      <w:proofErr w:type="spellStart"/>
-      <w:r>
-        <w:t>sisi</w:t>
-      </w:r>
-      <w:proofErr w:type="spellEnd"/>
-      <w:r>
-        <w:t xml:space="preserve"> </w:t>
-      </w:r>
-      <w:proofErr w:type="spellStart"/>
-      <w:r>
-        <w:t>penerima</w:t>
-      </w:r>
-      <w:proofErr w:type="spellEnd"/>
-      <w:r>
-        <w:t xml:space="preserve">, smartphone </w:t>
-      </w:r>
-      <w:proofErr w:type="spellStart"/>
-      <w:r>
-        <w:t>merangkai</w:t>
-      </w:r>
-      <w:proofErr w:type="spellEnd"/>
-      <w:r>
-        <w:t xml:space="preserve"> </w:t>
-      </w:r>
-      <w:proofErr w:type="spellStart"/>
-      <w:r>
-        <w:t>kembali</w:t>
-      </w:r>
-      <w:proofErr w:type="spellEnd"/>
-      <w:r>
-        <w:t xml:space="preserve"> </w:t>
-      </w:r>
-      <w:proofErr w:type="spellStart"/>
-      <w:r>
-        <w:t>potongan-potongan</w:t>
-      </w:r>
-      <w:proofErr w:type="spellEnd"/>
-      <w:r>
-        <w:t xml:space="preserve"> </w:t>
-      </w:r>
-      <w:proofErr w:type="spellStart"/>
-      <w:r>
-        <w:t>tersebut</w:t>
-      </w:r>
-      <w:proofErr w:type="spellEnd"/>
-      <w:r>
-        <w:t xml:space="preserve"> </w:t>
-      </w:r>
-      <w:proofErr w:type="spellStart"/>
-      <w:r>
-        <w:t>hingga</w:t>
-      </w:r>
-      <w:proofErr w:type="spellEnd"/>
-      <w:r>
-        <w:t xml:space="preserve"> frame END </w:t>
-      </w:r>
-      <w:proofErr w:type="spellStart"/>
-      <w:r>
-        <w:t>diterima</w:t>
-      </w:r>
-      <w:proofErr w:type="spellEnd"/>
-      <w:r>
-        <w:t xml:space="preserve">, </w:t>
-      </w:r>
-      <w:proofErr w:type="spellStart"/>
-      <w:r>
-        <w:t>lalu</w:t>
-      </w:r>
-      <w:proofErr w:type="spellEnd"/>
-      <w:r>
-        <w:t xml:space="preserve"> </w:t>
-      </w:r>
-      <w:proofErr w:type="spellStart"/>
-      <w:r>
-        <w:t>mendekodekannya</w:t>
-      </w:r>
-      <w:proofErr w:type="spellEnd"/>
-      <w:r>
-        <w:t xml:space="preserve"> </w:t>
-      </w:r>
-      <w:proofErr w:type="spellStart"/>
-      <w:r>
-        <w:t>menjadi</w:t>
-      </w:r>
-      <w:proofErr w:type="spellEnd"/>
-      <w:r>
-        <w:t xml:space="preserve"> </w:t>
-      </w:r>
-      <w:proofErr w:type="spellStart"/>
-      <w:r>
-        <w:t>satu</w:t>
-      </w:r>
-      <w:proofErr w:type="spellEnd"/>
-      <w:r>
-        <w:t xml:space="preserve"> array JSON yang </w:t>
-      </w:r>
-      <w:proofErr w:type="spellStart"/>
-      <w:r>
-        <w:t>utuh.</w:t>
-      </w:r>
-      <w:proofErr w:type="spellEnd"/>
+      <w:r/>
+      <w:r/>
     </w:p>
     <w:sectPr>
       <w:pgSz w:w="12240" w:h="15840"/>

</xml_diff>